<commit_message>
feat: add refrigeration domain guardrails
</commit_message>
<xml_diff>
--- a/documentation/CoolAgent_Documentacion_Maestra.docx
+++ b/documentation/CoolAgent_Documentacion_Maestra.docx
@@ -3739,6 +3739,349 @@
         <w:t>backend/alembic/README.md contiene los comandos recomendados para base nueva, base local existente y tests con coolagent_test.</w:t>
       </w:r>
     </w:p>
+    <w:p>
+      <w:pPr>
+        <w:pStyle w:val="Heading1"/>
+      </w:pPr>
+      <w:r>
+        <w:t>12. Fase B0: Guardrails del asistente</w:t>
+      </w:r>
+    </w:p>
+    <w:p>
+      <w:r>
+        <w:t>Antes de implementar cache/costos, CoolAgent define una politica estricta de dominio para que el asistente responda como tecnico de refrigeracion general. Esto evita guardar en cache respuestas fuera de alcance o contrarias al rol del producto.</w:t>
+      </w:r>
+    </w:p>
+    <w:tbl>
+      <w:tblPr>
+        <w:tblStyle w:val="TableGrid"/>
+        <w:tblW w:type="auto" w:w="0"/>
+        <w:jc w:val="center"/>
+        <w:tblLook w:firstColumn="1" w:firstRow="1" w:lastColumn="0" w:lastRow="0" w:noHBand="0" w:noVBand="1" w:val="04A0"/>
+      </w:tblPr>
+      <w:tblGrid>
+        <w:gridCol w:w="10224"/>
+      </w:tblGrid>
+      <w:tr>
+        <w:tc>
+          <w:tcPr>
+            <w:tcW w:type="dxa" w:w="10224"/>
+            <w:shd w:fill="FFF2CC"/>
+          </w:tcPr>
+          <w:p>
+            <w:r>
+              <w:rPr>
+                <w:b/>
+                <w:color w:val="17324D"/>
+                <w:sz w:val="20"/>
+              </w:rPr>
+              <w:t>Dominio correcto</w:t>
+            </w:r>
+          </w:p>
+          <w:p>
+            <w:r>
+              <w:rPr>
+                <w:sz w:val="18"/>
+              </w:rPr>
+              <w:t>CoolAgent cubre refrigeracion general y climatizacion aplicada: neveras, congeladores, aires acondicionados residenciales y comerciales, refrigeracion comercial e industrial, camaras frigorificas, chillers, bombas de calor, refrigerantes, electricidad aplicada, controles, seguridad, mantenimiento y diagnostico.</w:t>
+            </w:r>
+          </w:p>
+        </w:tc>
+      </w:tr>
+    </w:tbl>
+    <w:p/>
+    <w:tbl>
+      <w:tblPr>
+        <w:tblStyle w:val="TableGrid"/>
+        <w:tblW w:type="auto" w:w="0"/>
+        <w:jc w:val="center"/>
+        <w:tblLook w:firstColumn="1" w:firstRow="1" w:lastColumn="0" w:lastRow="0" w:noHBand="0" w:noVBand="1" w:val="04A0"/>
+      </w:tblPr>
+      <w:tblGrid>
+        <w:gridCol w:w="5112"/>
+        <w:gridCol w:w="5112"/>
+      </w:tblGrid>
+      <w:tr>
+        <w:tc>
+          <w:tcPr>
+            <w:tcW w:type="dxa" w:w="5112"/>
+            <w:shd w:fill="17324D"/>
+            <w:vAlign w:val="center"/>
+          </w:tcPr>
+          <w:p>
+            <w:pPr>
+              <w:jc w:val="left"/>
+            </w:pPr>
+            <w:r/>
+            <w:r>
+              <w:rPr>
+                <w:b/>
+                <w:color w:val="FFFFFF"/>
+                <w:sz w:val="18"/>
+              </w:rPr>
+              <w:t>Elemento</w:t>
+            </w:r>
+          </w:p>
+        </w:tc>
+        <w:tc>
+          <w:tcPr>
+            <w:tcW w:type="dxa" w:w="5112"/>
+            <w:shd w:fill="17324D"/>
+            <w:vAlign w:val="center"/>
+          </w:tcPr>
+          <w:p>
+            <w:pPr>
+              <w:jc w:val="left"/>
+            </w:pPr>
+            <w:r/>
+            <w:r>
+              <w:rPr>
+                <w:b/>
+                <w:color w:val="FFFFFF"/>
+                <w:sz w:val="18"/>
+              </w:rPr>
+              <w:t>Decision</w:t>
+            </w:r>
+          </w:p>
+        </w:tc>
+      </w:tr>
+      <w:tr>
+        <w:tc>
+          <w:tcPr>
+            <w:tcW w:type="dxa" w:w="5112"/>
+            <w:vAlign w:val="center"/>
+          </w:tcPr>
+          <w:p>
+            <w:pPr>
+              <w:jc w:val="left"/>
+            </w:pPr>
+            <w:r/>
+            <w:r>
+              <w:rPr>
+                <w:b w:val="0"/>
+                <w:sz w:val="18"/>
+              </w:rPr>
+              <w:t>System prompt</w:t>
+            </w:r>
+          </w:p>
+        </w:tc>
+        <w:tc>
+          <w:tcPr>
+            <w:tcW w:type="dxa" w:w="5112"/>
+            <w:vAlign w:val="center"/>
+          </w:tcPr>
+          <w:p>
+            <w:pPr>
+              <w:jc w:val="left"/>
+            </w:pPr>
+            <w:r/>
+            <w:r>
+              <w:rPr>
+                <w:b w:val="0"/>
+                <w:sz w:val="18"/>
+              </w:rPr>
+              <w:t>Rol actualizado a asistente tecnico de refrigeracion general para tecnicos de campo.</w:t>
+            </w:r>
+          </w:p>
+        </w:tc>
+      </w:tr>
+      <w:tr>
+        <w:tc>
+          <w:tcPr>
+            <w:tcW w:type="dxa" w:w="5112"/>
+            <w:vAlign w:val="center"/>
+          </w:tcPr>
+          <w:p>
+            <w:pPr>
+              <w:jc w:val="left"/>
+            </w:pPr>
+            <w:r/>
+            <w:r>
+              <w:rPr>
+                <w:b w:val="0"/>
+                <w:sz w:val="18"/>
+              </w:rPr>
+              <w:t>DomainGuard</w:t>
+            </w:r>
+          </w:p>
+        </w:tc>
+        <w:tc>
+          <w:tcPr>
+            <w:tcW w:type="dxa" w:w="5112"/>
+            <w:vAlign w:val="center"/>
+          </w:tcPr>
+          <w:p>
+            <w:pPr>
+              <w:jc w:val="left"/>
+            </w:pPr>
+            <w:r/>
+            <w:r>
+              <w:rPr>
+                <w:b w:val="0"/>
+                <w:sz w:val="18"/>
+              </w:rPr>
+              <w:t>Bloquea consultas claramente fuera de dominio antes de llamar a RAG o Claude.</w:t>
+            </w:r>
+          </w:p>
+        </w:tc>
+      </w:tr>
+      <w:tr>
+        <w:tc>
+          <w:tcPr>
+            <w:tcW w:type="dxa" w:w="5112"/>
+            <w:vAlign w:val="center"/>
+          </w:tcPr>
+          <w:p>
+            <w:pPr>
+              <w:jc w:val="left"/>
+            </w:pPr>
+            <w:r/>
+            <w:r>
+              <w:rPr>
+                <w:b w:val="0"/>
+                <w:sz w:val="18"/>
+              </w:rPr>
+              <w:t>Temas auxiliares</w:t>
+            </w:r>
+          </w:p>
+        </w:tc>
+        <w:tc>
+          <w:tcPr>
+            <w:tcW w:type="dxa" w:w="5112"/>
+            <w:vAlign w:val="center"/>
+          </w:tcPr>
+          <w:p>
+            <w:pPr>
+              <w:jc w:val="left"/>
+            </w:pPr>
+            <w:r/>
+            <w:r>
+              <w:rPr>
+                <w:b w:val="0"/>
+                <w:sz w:val="18"/>
+              </w:rPr>
+              <w:t>Electricidad, seguridad, herramientas, normativa y mediciones se permiten si estan conectadas al trabajo tecnico.</w:t>
+            </w:r>
+          </w:p>
+        </w:tc>
+      </w:tr>
+      <w:tr>
+        <w:tc>
+          <w:tcPr>
+            <w:tcW w:type="dxa" w:w="5112"/>
+            <w:vAlign w:val="center"/>
+          </w:tcPr>
+          <w:p>
+            <w:pPr>
+              <w:jc w:val="left"/>
+            </w:pPr>
+            <w:r/>
+            <w:r>
+              <w:rPr>
+                <w:b w:val="0"/>
+                <w:sz w:val="18"/>
+              </w:rPr>
+              <w:t>Prompt policy version</w:t>
+            </w:r>
+          </w:p>
+        </w:tc>
+        <w:tc>
+          <w:tcPr>
+            <w:tcW w:type="dxa" w:w="5112"/>
+            <w:vAlign w:val="center"/>
+          </w:tcPr>
+          <w:p>
+            <w:pPr>
+              <w:jc w:val="left"/>
+            </w:pPr>
+            <w:r/>
+            <w:r>
+              <w:rPr>
+                <w:b w:val="0"/>
+                <w:sz w:val="18"/>
+              </w:rPr>
+              <w:t>Se define PROMPT_POLICY_VERSION=refrigeration-general-v1 para invalidar cache futuro si cambia la politica.</w:t>
+            </w:r>
+          </w:p>
+        </w:tc>
+      </w:tr>
+      <w:tr>
+        <w:tc>
+          <w:tcPr>
+            <w:tcW w:type="dxa" w:w="5112"/>
+            <w:vAlign w:val="center"/>
+          </w:tcPr>
+          <w:p>
+            <w:pPr>
+              <w:jc w:val="left"/>
+            </w:pPr>
+            <w:r/>
+            <w:r>
+              <w:rPr>
+                <w:b w:val="0"/>
+                <w:sz w:val="18"/>
+              </w:rPr>
+              <w:t>Tests</w:t>
+            </w:r>
+          </w:p>
+        </w:tc>
+        <w:tc>
+          <w:tcPr>
+            <w:tcW w:type="dxa" w:w="5112"/>
+            <w:vAlign w:val="center"/>
+          </w:tcPr>
+          <w:p>
+            <w:pPr>
+              <w:jc w:val="left"/>
+            </w:pPr>
+            <w:r/>
+            <w:r>
+              <w:rPr>
+                <w:b w:val="0"/>
+                <w:sz w:val="18"/>
+              </w:rPr>
+              <w:t>Casos permitidos, rechazados y prompt injection se cubren sin llamar a Claude real.</w:t>
+            </w:r>
+          </w:p>
+        </w:tc>
+      </w:tr>
+    </w:tbl>
+    <w:p/>
+    <w:p>
+      <w:pPr>
+        <w:pStyle w:val="Heading2"/>
+      </w:pPr>
+      <w:r>
+        <w:t>12.1 Relacion con Fase B</w:t>
+      </w:r>
+    </w:p>
+    <w:p>
+      <w:pPr>
+        <w:pStyle w:val="ListBullet"/>
+        <w:spacing w:after="40"/>
+      </w:pPr>
+      <w:r>
+        <w:t>Fase B0 debe quedar antes de cache/costos.</w:t>
+      </w:r>
+    </w:p>
+    <w:p>
+      <w:pPr>
+        <w:pStyle w:val="ListBullet"/>
+        <w:spacing w:after="40"/>
+      </w:pPr>
+      <w:r>
+        <w:t>El cache futuro debe incluir la version de politica del prompt en la llave o metadata.</w:t>
+      </w:r>
+    </w:p>
+    <w:p>
+      <w:pPr>
+        <w:pStyle w:val="ListBullet"/>
+        <w:spacing w:after="40"/>
+      </w:pPr>
+      <w:r>
+        <w:t>Si cambia el comportamiento del asistente, respuestas cacheadas con politicas anteriores no deben reutilizarse.</w:t>
+      </w:r>
+    </w:p>
     <w:sectPr>
       <w:footerReference w:type="default" r:id="rId9"/>
       <w:pgSz w:w="12240" w:h="15840"/>

</xml_diff>

<commit_message>
feat: add usage tracking and exact chat cache
</commit_message>
<xml_diff>
--- a/documentation/CoolAgent_Documentacion_Maestra.docx
+++ b/documentation/CoolAgent_Documentacion_Maestra.docx
@@ -79,16 +79,8 @@
             <w:vAlign w:val="center"/>
           </w:tcPr>
           <w:p>
-            <w:pPr>
-              <w:jc w:val="left"/>
-            </w:pPr>
-            <w:r/>
             <w:r>
-              <w:rPr>
-                <w:b w:val="0"/>
-                <w:sz w:val="18"/>
-              </w:rPr>
-              <w:t>30 de abril de 2026</w:t>
+              <w:t>1 de mayo de 2026</w:t>
             </w:r>
           </w:p>
         </w:tc>
@@ -219,6 +211,9 @@
     </w:tbl>
     <w:p>
       <w:r>
+        <w:rPr>
+          <w:sz w:val="21"/>
+        </w:rPr>
         <w:br w:type="page"/>
       </w:r>
     </w:p>
@@ -227,11 +222,17 @@
         <w:pStyle w:val="Heading1"/>
       </w:pPr>
       <w:r>
+        <w:rPr>
+          <w:sz w:val="21"/>
+        </w:rPr>
         <w:t>1. Vision del producto</w:t>
       </w:r>
     </w:p>
     <w:p>
       <w:r>
+        <w:rPr>
+          <w:sz w:val="21"/>
+        </w:rPr>
         <w:t>CoolAgent es una aplicacion movil para tecnicos de refrigeracion y HVAC/R. Su objetivo es reducir tiempo de diagnostico en campo mediante chat especializado, recuperacion de documentacion tecnica, diagnostico por imagen, calculadoras, codigos de error y capacidades offline.</w:t>
       </w:r>
     </w:p>
@@ -285,6 +286,9 @@
         <w:pStyle w:val="Heading1"/>
       </w:pPr>
       <w:r>
+        <w:rPr>
+          <w:sz w:val="21"/>
+        </w:rPr>
         <w:t>2. Estado real del proyecto</w:t>
       </w:r>
     </w:p>
@@ -411,16 +415,8 @@
             <w:shd w:fill="D9EAD3"/>
           </w:tcPr>
           <w:p>
-            <w:pPr>
-              <w:jc w:val="left"/>
-            </w:pPr>
-            <w:r/>
             <w:r>
-              <w:rPr>
-                <w:b w:val="0"/>
-                <w:sz w:val="18"/>
-              </w:rPr>
-              <w:t>Completado y probado end-to-end: ingesta, embeddings locales, busqueda pgvector, contexto en chat y respuesta de Claude citando fuente.</w:t>
+              <w:t>Fase A cerrada: ingesta, embeddings locales, busqueda pgvector, chat con contexto, glosario, Alembic y tests robustos.</w:t>
             </w:r>
           </w:p>
         </w:tc>
@@ -452,16 +448,8 @@
             <w:shd w:fill="EDEDED"/>
           </w:tcPr>
           <w:p>
-            <w:pPr>
-              <w:jc w:val="left"/>
-            </w:pPr>
-            <w:r/>
             <w:r>
-              <w:rPr>
-                <w:b w:val="0"/>
-                <w:sz w:val="18"/>
-              </w:rPr>
-              <w:t>Implementado con conversaciones persistidas, provider Claude y prompt especializado HVAC/R.</w:t>
+              <w:t>Implementado con conversaciones persistidas, provider Claude, prompt de refrigeracion general, DomainGuard, RAG, cache exacto y tracking de uso/tokens.</w:t>
             </w:r>
           </w:p>
         </w:tc>
@@ -671,6 +659,28 @@
           </w:p>
         </w:tc>
       </w:tr>
+      <w:tr>
+        <w:tc>
+          <w:tcPr>
+            <w:tcW w:type="dxa" w:w="5112"/>
+          </w:tcPr>
+          <w:p>
+            <w:r>
+              <w:t>Uso, tokens y cache</w:t>
+            </w:r>
+          </w:p>
+        </w:tc>
+        <w:tc>
+          <w:tcPr>
+            <w:tcW w:type="dxa" w:w="5112"/>
+          </w:tcPr>
+          <w:p>
+            <w:r>
+              <w:t>Parcial implementado en Fase B: tabla usage_events, endpoint de resumen y cache exacto con Redis. Queda pendiente cache semantico y politica fina de costos.</w:t>
+            </w:r>
+          </w:p>
+        </w:tc>
+      </w:tr>
     </w:tbl>
     <w:p/>
     <w:tbl>
@@ -723,6 +733,9 @@
         <w:pStyle w:val="Heading1"/>
       </w:pPr>
       <w:r>
+        <w:rPr>
+          <w:sz w:val="21"/>
+        </w:rPr>
         <w:t>3. Arquitectura actual local</w:t>
       </w:r>
     </w:p>
@@ -732,6 +745,9 @@
         <w:spacing w:after="40"/>
       </w:pPr>
       <w:r>
+        <w:rPr>
+          <w:sz w:val="21"/>
+        </w:rPr>
         <w:t>API: FastAPI con SQLAlchemy async y routers versionados bajo /api/v1.</w:t>
       </w:r>
     </w:p>
@@ -741,6 +757,9 @@
         <w:spacing w:after="40"/>
       </w:pPr>
       <w:r>
+        <w:rPr>
+          <w:sz w:val="21"/>
+        </w:rPr>
         <w:t>Base de datos: PostgreSQL 16 con extension pgvector para chunks semanticos.</w:t>
       </w:r>
     </w:p>
@@ -750,6 +769,9 @@
         <w:spacing w:after="40"/>
       </w:pPr>
       <w:r>
+        <w:rPr>
+          <w:sz w:val="21"/>
+        </w:rPr>
         <w:t>Cache/infra local: Redis y MinIO levantados por Docker Compose.</w:t>
       </w:r>
     </w:p>
@@ -759,6 +781,9 @@
         <w:spacing w:after="40"/>
       </w:pPr>
       <w:r>
+        <w:rPr>
+          <w:sz w:val="21"/>
+        </w:rPr>
         <w:t>LLM desarrollo: Claude API directa mediante ClaudeProvider.</w:t>
       </w:r>
     </w:p>
@@ -768,6 +793,9 @@
         <w:spacing w:after="40"/>
       </w:pPr>
       <w:r>
+        <w:rPr>
+          <w:sz w:val="21"/>
+        </w:rPr>
         <w:t>Embeddings RAG: sentence-transformers local dentro de la API, independiente del proveedor de chat.</w:t>
       </w:r>
     </w:p>
@@ -777,6 +805,9 @@
         <w:spacing w:after="40"/>
       </w:pPr>
       <w:r>
+        <w:rPr>
+          <w:sz w:val="21"/>
+        </w:rPr>
         <w:t>RAG: documentos -&gt; chunking -&gt; embeddings -&gt; knowledge_chunks -&gt; retrieval -&gt; prompt injection.</w:t>
       </w:r>
     </w:p>
@@ -830,6 +861,9 @@
         <w:pStyle w:val="Heading1"/>
       </w:pPr>
       <w:r>
+        <w:rPr>
+          <w:sz w:val="21"/>
+        </w:rPr>
         <w:t>4. Arquitectura objetivo de produccion</w:t>
       </w:r>
     </w:p>
@@ -839,6 +873,9 @@
         <w:spacing w:after="40"/>
       </w:pPr>
       <w:r>
+        <w:rPr>
+          <w:sz w:val="21"/>
+        </w:rPr>
         <w:t>Mantener Strategy Pattern para cambiar proveedores sin reescribir logica de negocio.</w:t>
       </w:r>
     </w:p>
@@ -848,6 +885,9 @@
         <w:spacing w:after="40"/>
       </w:pPr>
       <w:r>
+        <w:rPr>
+          <w:sz w:val="21"/>
+        </w:rPr>
         <w:t>Produccion prevista en AWS: ECS/Fargate o equivalente, RDS PostgreSQL con pgvector, ElastiCache Redis, S3 y Bedrock/Claude segun costo/calidad.</w:t>
       </w:r>
     </w:p>
@@ -857,6 +897,9 @@
         <w:spacing w:after="40"/>
       </w:pPr>
       <w:r>
+        <w:rPr>
+          <w:sz w:val="21"/>
+        </w:rPr>
         <w:t>Autenticacion prevista con Cognito/JWT y roles technician/admin.</w:t>
       </w:r>
     </w:p>
@@ -866,6 +909,9 @@
         <w:spacing w:after="40"/>
       </w:pPr>
       <w:r>
+        <w:rPr>
+          <w:sz w:val="21"/>
+        </w:rPr>
         <w:t>Migraciones reales con Alembic antes de promover cambios de esquema.</w:t>
       </w:r>
     </w:p>
@@ -875,6 +921,9 @@
         <w:spacing w:after="40"/>
       </w:pPr>
       <w:r>
+        <w:rPr>
+          <w:sz w:val="21"/>
+        </w:rPr>
         <w:t>Observabilidad pendiente: logs estructurados, metricas de costo/tokens, errores de proveedor AI y tiempos de retrieval.</w:t>
       </w:r>
     </w:p>
@@ -883,6 +932,9 @@
         <w:pStyle w:val="Heading1"/>
       </w:pPr>
       <w:r>
+        <w:rPr>
+          <w:sz w:val="21"/>
+        </w:rPr>
         <w:t>5. Modulos del producto</w:t>
       </w:r>
     </w:p>
@@ -1030,16 +1082,8 @@
             <w:vAlign w:val="center"/>
           </w:tcPr>
           <w:p>
-            <w:pPr>
-              <w:jc w:val="left"/>
-            </w:pPr>
-            <w:r/>
             <w:r>
-              <w:rPr>
-                <w:b w:val="0"/>
-                <w:sz w:val="18"/>
-              </w:rPr>
-              <w:t>Chat HVAC/R</w:t>
+              <w:t>Chat refrigeracion general</w:t>
             </w:r>
           </w:p>
         </w:tc>
@@ -1050,15 +1094,7 @@
             <w:shd w:fill="D9EAD3"/>
           </w:tcPr>
           <w:p>
-            <w:pPr>
-              <w:jc w:val="left"/>
-            </w:pPr>
-            <w:r/>
             <w:r>
-              <w:rPr>
-                <w:b w:val="0"/>
-                <w:sz w:val="18"/>
-              </w:rPr>
               <w:t>Completado parcial</w:t>
             </w:r>
           </w:p>
@@ -1069,16 +1105,8 @@
             <w:vAlign w:val="center"/>
           </w:tcPr>
           <w:p>
-            <w:pPr>
-              <w:jc w:val="left"/>
-            </w:pPr>
-            <w:r/>
             <w:r>
-              <w:rPr>
-                <w:b w:val="0"/>
-                <w:sz w:val="18"/>
-              </w:rPr>
-              <w:t>Funciona con Claude y RAG; falta streaming, cache, rate limiting y autenticacion.</w:t>
+              <w:t>Funciona con Claude, RAG, prompt versionado, DomainGuard y cache exacto. Falta streaming, autenticacion, cuotas y UX final.</w:t>
             </w:r>
           </w:p>
         </w:tc>
@@ -1443,6 +1471,38 @@
           </w:p>
         </w:tc>
       </w:tr>
+      <w:tr>
+        <w:tc>
+          <w:tcPr>
+            <w:tcW w:type="dxa" w:w="3408"/>
+          </w:tcPr>
+          <w:p>
+            <w:r>
+              <w:t>Uso, tokens y cache</w:t>
+            </w:r>
+          </w:p>
+        </w:tc>
+        <w:tc>
+          <w:tcPr>
+            <w:tcW w:type="dxa" w:w="3408"/>
+          </w:tcPr>
+          <w:p>
+            <w:r>
+              <w:t>Parcial implementado</w:t>
+            </w:r>
+          </w:p>
+        </w:tc>
+        <w:tc>
+          <w:tcPr>
+            <w:tcW w:type="dxa" w:w="3408"/>
+          </w:tcPr>
+          <w:p>
+            <w:r>
+              <w:t>UsageEvent registra tokens, cache hits/misses y bloqueos de dominio. Redis cachea respuestas exactas con TTL e invalidacion por version de prompt, historial y contexto RAG.</w:t>
+            </w:r>
+          </w:p>
+        </w:tc>
+      </w:tr>
     </w:tbl>
     <w:p/>
     <w:p>
@@ -1450,6 +1510,9 @@
         <w:pStyle w:val="Heading1"/>
       </w:pPr>
       <w:r>
+        <w:rPr>
+          <w:sz w:val="21"/>
+        </w:rPr>
         <w:t>6. Inventario de APIs actuales</w:t>
       </w:r>
     </w:p>
@@ -2310,6 +2373,38 @@
           </w:p>
         </w:tc>
       </w:tr>
+      <w:tr>
+        <w:tc>
+          <w:tcPr>
+            <w:tcW w:type="dxa" w:w="3408"/>
+          </w:tcPr>
+          <w:p>
+            <w:r>
+              <w:t>Usage</w:t>
+            </w:r>
+          </w:p>
+        </w:tc>
+        <w:tc>
+          <w:tcPr>
+            <w:tcW w:type="dxa" w:w="3408"/>
+          </w:tcPr>
+          <w:p>
+            <w:r>
+              <w:t>GET /api/v1/usage/summary</w:t>
+            </w:r>
+          </w:p>
+        </w:tc>
+        <w:tc>
+          <w:tcPr>
+            <w:tcW w:type="dxa" w:w="3408"/>
+          </w:tcPr>
+          <w:p>
+            <w:r>
+              <w:t>Actual: resume tokens, cache hits/misses y bloqueos de dominio.</w:t>
+            </w:r>
+          </w:p>
+        </w:tc>
+      </w:tr>
     </w:tbl>
     <w:p/>
     <w:p>
@@ -2317,6 +2412,9 @@
         <w:pStyle w:val="Heading1"/>
       </w:pPr>
       <w:r>
+        <w:rPr>
+          <w:sz w:val="21"/>
+        </w:rPr>
         <w:t>7. Roadmap actualizado</w:t>
       </w:r>
     </w:p>
@@ -2404,15 +2502,7 @@
             <w:vAlign w:val="center"/>
           </w:tcPr>
           <w:p>
-            <w:pPr>
-              <w:jc w:val="left"/>
-            </w:pPr>
-            <w:r/>
             <w:r>
-              <w:rPr>
-                <w:b w:val="0"/>
-                <w:sz w:val="18"/>
-              </w:rPr>
               <w:t>1</w:t>
             </w:r>
           </w:p>
@@ -2423,16 +2513,8 @@
             <w:vAlign w:val="center"/>
           </w:tcPr>
           <w:p>
-            <w:pPr>
-              <w:jc w:val="left"/>
-            </w:pPr>
-            <w:r/>
             <w:r>
-              <w:rPr>
-                <w:b w:val="0"/>
-                <w:sz w:val="18"/>
-              </w:rPr>
-              <w:t>Cerrar milestone RAG</w:t>
+              <w:t>Fase A cerrada</w:t>
             </w:r>
           </w:p>
         </w:tc>
@@ -2442,16 +2524,8 @@
             <w:vAlign w:val="center"/>
           </w:tcPr>
           <w:p>
-            <w:pPr>
-              <w:jc w:val="left"/>
-            </w:pPr>
-            <w:r/>
             <w:r>
-              <w:rPr>
-                <w:b w:val="0"/>
-                <w:sz w:val="18"/>
-              </w:rPr>
-              <w:t>Siguiente paso recomendado. Agregar migracion formal, tests minimos, limpiar cambios y hacer commit.</w:t>
+              <w:t>RAG protegido: Alembic, tests, glosario y datos locales conservados.</w:t>
             </w:r>
           </w:p>
         </w:tc>
@@ -2463,15 +2537,7 @@
             <w:vAlign w:val="center"/>
           </w:tcPr>
           <w:p>
-            <w:pPr>
-              <w:jc w:val="left"/>
-            </w:pPr>
-            <w:r/>
             <w:r>
-              <w:rPr>
-                <w:b w:val="0"/>
-                <w:sz w:val="18"/>
-              </w:rPr>
               <w:t>2</w:t>
             </w:r>
           </w:p>
@@ -2482,16 +2548,8 @@
             <w:vAlign w:val="center"/>
           </w:tcPr>
           <w:p>
-            <w:pPr>
-              <w:jc w:val="left"/>
-            </w:pPr>
-            <w:r/>
             <w:r>
-              <w:rPr>
-                <w:b w:val="0"/>
-                <w:sz w:val="18"/>
-              </w:rPr>
-              <w:t>Cache y control de costos</w:t>
+              <w:t>Fase B0 cerrada</w:t>
             </w:r>
           </w:p>
         </w:tc>
@@ -2501,16 +2559,8 @@
             <w:vAlign w:val="center"/>
           </w:tcPr>
           <w:p>
-            <w:pPr>
-              <w:jc w:val="left"/>
-            </w:pPr>
-            <w:r/>
             <w:r>
-              <w:rPr>
-                <w:b w:val="0"/>
-                <w:sz w:val="18"/>
-              </w:rPr>
-              <w:t>Redis para respuestas similares, tracking de tokens y politicas de TTL.</w:t>
+              <w:t>Prompt y guardrails de refrigeracion general antes de cachear respuestas.</w:t>
             </w:r>
           </w:p>
         </w:tc>
@@ -2522,15 +2572,7 @@
             <w:vAlign w:val="center"/>
           </w:tcPr>
           <w:p>
-            <w:pPr>
-              <w:jc w:val="left"/>
-            </w:pPr>
-            <w:r/>
             <w:r>
-              <w:rPr>
-                <w:b w:val="0"/>
-                <w:sz w:val="18"/>
-              </w:rPr>
               <w:t>3</w:t>
             </w:r>
           </w:p>
@@ -2541,15 +2583,42 @@
             <w:vAlign w:val="center"/>
           </w:tcPr>
           <w:p>
-            <w:pPr>
-              <w:jc w:val="left"/>
-            </w:pPr>
-            <w:r/>
             <w:r>
-              <w:rPr>
-                <w:b w:val="0"/>
-                <w:sz w:val="18"/>
-              </w:rPr>
+              <w:t>Fase B en progreso</w:t>
+            </w:r>
+          </w:p>
+        </w:tc>
+        <w:tc>
+          <w:tcPr>
+            <w:tcW w:type="dxa" w:w="6048"/>
+            <w:vAlign w:val="center"/>
+          </w:tcPr>
+          <w:p>
+            <w:r>
+              <w:t>Implementado tracking de uso/tokens y cache exacto con Redis. Pendiente cache semantico, invalidacion avanzada y precios configurables.</w:t>
+            </w:r>
+          </w:p>
+        </w:tc>
+      </w:tr>
+      <w:tr>
+        <w:tc>
+          <w:tcPr>
+            <w:tcW w:type="dxa" w:w="1152"/>
+            <w:vAlign w:val="center"/>
+          </w:tcPr>
+          <w:p>
+            <w:r>
+              <w:t>4</w:t>
+            </w:r>
+          </w:p>
+        </w:tc>
+        <w:tc>
+          <w:tcPr>
+            <w:tcW w:type="dxa" w:w="3024"/>
+            <w:vAlign w:val="center"/>
+          </w:tcPr>
+          <w:p>
+            <w:r>
               <w:t>WebSocket streaming</w:t>
             </w:r>
           </w:p>
@@ -2560,15 +2629,7 @@
             <w:vAlign w:val="center"/>
           </w:tcPr>
           <w:p>
-            <w:pPr>
-              <w:jc w:val="left"/>
-            </w:pPr>
-            <w:r/>
             <w:r>
-              <w:rPr>
-                <w:b w:val="0"/>
-                <w:sz w:val="18"/>
-              </w:rPr>
               <w:t>Mejorar UX del chat con respuesta en tiempo real.</w:t>
             </w:r>
           </w:p>
@@ -2581,16 +2642,8 @@
             <w:vAlign w:val="center"/>
           </w:tcPr>
           <w:p>
-            <w:pPr>
-              <w:jc w:val="left"/>
-            </w:pPr>
-            <w:r/>
             <w:r>
-              <w:rPr>
-                <w:b w:val="0"/>
-                <w:sz w:val="18"/>
-              </w:rPr>
-              <w:t>4</w:t>
+              <w:t>5</w:t>
             </w:r>
           </w:p>
         </w:tc>
@@ -2600,15 +2653,7 @@
             <w:vAlign w:val="center"/>
           </w:tcPr>
           <w:p>
-            <w:pPr>
-              <w:jc w:val="left"/>
-            </w:pPr>
-            <w:r/>
             <w:r>
-              <w:rPr>
-                <w:b w:val="0"/>
-                <w:sz w:val="18"/>
-              </w:rPr>
               <w:t>Codigos de error</w:t>
             </w:r>
           </w:p>
@@ -2619,15 +2664,7 @@
             <w:vAlign w:val="center"/>
           </w:tcPr>
           <w:p>
-            <w:pPr>
-              <w:jc w:val="left"/>
-            </w:pPr>
-            <w:r/>
             <w:r>
-              <w:rPr>
-                <w:b w:val="0"/>
-                <w:sz w:val="18"/>
-              </w:rPr>
               <w:t>Seed inicial por fabricante/modelo y endpoints reales de busqueda.</w:t>
             </w:r>
           </w:p>
@@ -2636,58 +2673,31 @@
       <w:tr>
         <w:tc>
           <w:tcPr>
-            <w:tcW w:type="dxa" w:w="1152"/>
-            <w:vAlign w:val="center"/>
+            <w:tcW w:type="dxa" w:w="3408"/>
           </w:tcPr>
           <w:p>
-            <w:pPr>
-              <w:jc w:val="left"/>
-            </w:pPr>
-            <w:r/>
             <w:r>
-              <w:rPr>
-                <w:b w:val="0"/>
-                <w:sz w:val="18"/>
-              </w:rPr>
-              <w:t>5</w:t>
+              <w:t>6</w:t>
             </w:r>
           </w:p>
         </w:tc>
         <w:tc>
           <w:tcPr>
-            <w:tcW w:type="dxa" w:w="3024"/>
-            <w:vAlign w:val="center"/>
+            <w:tcW w:type="dxa" w:w="3408"/>
           </w:tcPr>
           <w:p>
-            <w:pPr>
-              <w:jc w:val="left"/>
-            </w:pPr>
-            <w:r/>
             <w:r>
-              <w:rPr>
-                <w:b w:val="0"/>
-                <w:sz w:val="18"/>
-              </w:rPr>
               <w:t>Frontend MVP</w:t>
             </w:r>
           </w:p>
         </w:tc>
         <w:tc>
           <w:tcPr>
-            <w:tcW w:type="dxa" w:w="6048"/>
-            <w:vAlign w:val="center"/>
+            <w:tcW w:type="dxa" w:w="3408"/>
           </w:tcPr>
           <w:p>
-            <w:pPr>
-              <w:jc w:val="left"/>
-            </w:pPr>
-            <w:r/>
             <w:r>
-              <w:rPr>
-                <w:b w:val="0"/>
-                <w:sz w:val="18"/>
-              </w:rPr>
-              <w:t>Iniciar cuando backend/RAG este consolidado y documentado.</w:t>
+              <w:t>Iniciar cuando el backend tenga contratos de API estables para chat, RAG, usage y errores.</w:t>
             </w:r>
           </w:p>
         </w:tc>
@@ -2699,11 +2709,17 @@
         <w:pStyle w:val="Heading1"/>
       </w:pPr>
       <w:r>
+        <w:rPr>
+          <w:sz w:val="21"/>
+        </w:rPr>
         <w:t>8. Proximo paso recomendado</w:t>
       </w:r>
     </w:p>
     <w:p>
       <w:r>
+        <w:rPr>
+          <w:sz w:val="21"/>
+        </w:rPr>
         <w:t>Antes de iniciar otra feature, cerrar formalmente el milestone RAG:</w:t>
       </w:r>
     </w:p>
@@ -2713,6 +2729,9 @@
         <w:spacing w:after="40"/>
       </w:pPr>
       <w:r>
+        <w:rPr>
+          <w:sz w:val="21"/>
+        </w:rPr>
         <w:t>Agregar migracion real o estrategia limpia de esquema para pgvector y columnas nuevas.</w:t>
       </w:r>
     </w:p>
@@ -2722,6 +2741,9 @@
         <w:spacing w:after="40"/>
       </w:pPr>
       <w:r>
+        <w:rPr>
+          <w:sz w:val="21"/>
+        </w:rPr>
         <w:t>Agregar tests minimos de RAG: ingesta, busqueda y chat con contexto mockeado.</w:t>
       </w:r>
     </w:p>
@@ -2731,6 +2753,9 @@
         <w:spacing w:after="40"/>
       </w:pPr>
       <w:r>
+        <w:rPr>
+          <w:sz w:val="21"/>
+        </w:rPr>
         <w:t>Limpiar y revisar cambios sin trackear relacionados al RAG.</w:t>
       </w:r>
     </w:p>
@@ -2740,6 +2765,9 @@
         <w:spacing w:after="40"/>
       </w:pPr>
       <w:r>
+        <w:rPr>
+          <w:sz w:val="21"/>
+        </w:rPr>
         <w:t>Hacer commit del backend RAG como hito estable.</w:t>
       </w:r>
     </w:p>
@@ -2793,6 +2821,9 @@
         <w:pStyle w:val="Heading1"/>
       </w:pPr>
       <w:r>
+        <w:rPr>
+          <w:sz w:val="21"/>
+        </w:rPr>
         <w:t>9. Indice de documentos existentes</w:t>
       </w:r>
     </w:p>
@@ -3240,6 +3271,9 @@
         <w:pStyle w:val="Heading1"/>
       </w:pPr>
       <w:r>
+        <w:rPr>
+          <w:sz w:val="21"/>
+        </w:rPr>
         <w:t>10. Reglas de mantenimiento documental</w:t>
       </w:r>
     </w:p>
@@ -3249,6 +3283,9 @@
         <w:spacing w:after="40"/>
       </w:pPr>
       <w:r>
+        <w:rPr>
+          <w:sz w:val="21"/>
+        </w:rPr>
         <w:t>Actualizar este DOCX maestro al cerrar cada milestone tecnico.</w:t>
       </w:r>
     </w:p>
@@ -3258,6 +3295,9 @@
         <w:spacing w:after="40"/>
       </w:pPr>
       <w:r>
+        <w:rPr>
+          <w:sz w:val="21"/>
+        </w:rPr>
         <w:t>Usar plans/ solo para planes temporales de la tarea activa; no como documentacion permanente.</w:t>
       </w:r>
     </w:p>
@@ -3267,6 +3307,9 @@
         <w:spacing w:after="40"/>
       </w:pPr>
       <w:r>
+        <w:rPr>
+          <w:sz w:val="21"/>
+        </w:rPr>
         <w:t>Si se cambia una API publica, actualizar el inventario de APIs en este documento.</w:t>
       </w:r>
     </w:p>
@@ -3276,6 +3319,9 @@
         <w:spacing w:after="40"/>
       </w:pPr>
       <w:r>
+        <w:rPr>
+          <w:sz w:val="21"/>
+        </w:rPr>
         <w:t>Si se cambia arquitectura AI, actualizar la seccion de arquitectura local y el indice de documentos historicos.</w:t>
       </w:r>
     </w:p>
@@ -3285,6 +3331,9 @@
         <w:spacing w:after="40"/>
       </w:pPr>
       <w:r>
+        <w:rPr>
+          <w:sz w:val="21"/>
+        </w:rPr>
         <w:t>Evitar que documentos historicos vuelvan a ser fuente de verdad sin revisarlos primero.</w:t>
       </w:r>
     </w:p>
@@ -3293,11 +3342,17 @@
         <w:pStyle w:val="Heading1"/>
       </w:pPr>
       <w:r>
+        <w:rPr>
+          <w:sz w:val="21"/>
+        </w:rPr>
         <w:t>11. Cierre de Fase A</w:t>
       </w:r>
     </w:p>
     <w:p>
       <w:r>
+        <w:rPr>
+          <w:sz w:val="21"/>
+        </w:rPr>
         <w:t>Fase A no implica pasar a staging o produccion ahora. El objetivo es dejar el RAG con bases tecnicas sanas para que, cuando llegue ese momento, el cambio sea controlado y no dependa de memoria, parches manuales o create_all().</w:t>
       </w:r>
     </w:p>
@@ -3604,6 +3659,9 @@
         <w:pStyle w:val="Heading2"/>
       </w:pPr>
       <w:r>
+        <w:rPr>
+          <w:sz w:val="21"/>
+        </w:rPr>
         <w:t>11.1 Que resuelve Alembic</w:t>
       </w:r>
     </w:p>
@@ -3613,6 +3671,9 @@
         <w:spacing w:after="40"/>
       </w:pPr>
       <w:r>
+        <w:rPr>
+          <w:sz w:val="21"/>
+        </w:rPr>
         <w:t>Evita perder el RAG cuando existan documentos reales y haya que cambiar el schema.</w:t>
       </w:r>
     </w:p>
@@ -3622,6 +3683,9 @@
         <w:spacing w:after="40"/>
       </w:pPr>
       <w:r>
+        <w:rPr>
+          <w:sz w:val="21"/>
+        </w:rPr>
         <w:t>Permite saber exactamente que version de base de datos espera el codigo.</w:t>
       </w:r>
     </w:p>
@@ -3631,6 +3695,9 @@
         <w:spacing w:after="40"/>
       </w:pPr>
       <w:r>
+        <w:rPr>
+          <w:sz w:val="21"/>
+        </w:rPr>
         <w:t>Hace repetible crear una base desde cero para tests, otra maquina o un futuro staging.</w:t>
       </w:r>
     </w:p>
@@ -3640,6 +3707,9 @@
         <w:spacing w:after="40"/>
       </w:pPr>
       <w:r>
+        <w:rPr>
+          <w:sz w:val="21"/>
+        </w:rPr>
         <w:t>Reduce el riesgo de depender de create_all(), que crea tablas nuevas pero no migra tablas existentes.</w:t>
       </w:r>
     </w:p>
@@ -3648,6 +3718,9 @@
         <w:pStyle w:val="Heading2"/>
       </w:pPr>
       <w:r>
+        <w:rPr>
+          <w:sz w:val="21"/>
+        </w:rPr>
         <w:t>11.2 Como se valida Fase A</w:t>
       </w:r>
     </w:p>
@@ -3657,6 +3730,9 @@
         <w:spacing w:after="40"/>
       </w:pPr>
       <w:r>
+        <w:rPr>
+          <w:sz w:val="21"/>
+        </w:rPr>
         <w:t>Unit tests para prompt RAG, ingesta, contexto, PDF sin texto y chat con Claude mockeado.</w:t>
       </w:r>
     </w:p>
@@ -3666,6 +3742,9 @@
         <w:spacing w:after="40"/>
       </w:pPr>
       <w:r>
+        <w:rPr>
+          <w:sz w:val="21"/>
+        </w:rPr>
         <w:t>Integration tests con PostgreSQL/pgvector real para alembic upgrade head, vector(384), ingesta, busqueda, filtros, cascada de borrado y glosario.</w:t>
       </w:r>
     </w:p>
@@ -3675,6 +3754,9 @@
         <w:spacing w:after="40"/>
       </w:pPr>
       <w:r>
+        <w:rPr>
+          <w:sz w:val="21"/>
+        </w:rPr>
         <w:t>El glosario sirve como catalogo vivo de fuentes usadas por el RAG.</w:t>
       </w:r>
     </w:p>
@@ -3683,6 +3765,9 @@
         <w:pStyle w:val="Heading2"/>
       </w:pPr>
       <w:r>
+        <w:rPr>
+          <w:sz w:val="21"/>
+        </w:rPr>
         <w:t>11.3 Base local existente y Alembic</w:t>
       </w:r>
     </w:p>
@@ -3732,10 +3817,14 @@
       <w:r>
         <w:rPr>
           <w:b/>
+          <w:sz w:val="21"/>
         </w:rPr>
         <w:t xml:space="preserve">Referencia tecnica: </w:t>
       </w:r>
       <w:r>
+        <w:rPr>
+          <w:sz w:val="21"/>
+        </w:rPr>
         <w:t>backend/alembic/README.md contiene los comandos recomendados para base nueva, base local existente y tests con coolagent_test.</w:t>
       </w:r>
     </w:p>
@@ -3744,11 +3833,17 @@
         <w:pStyle w:val="Heading1"/>
       </w:pPr>
       <w:r>
+        <w:rPr>
+          <w:sz w:val="21"/>
+        </w:rPr>
         <w:t>12. Fase B0: Guardrails del asistente</w:t>
       </w:r>
     </w:p>
     <w:p>
       <w:r>
+        <w:rPr>
+          <w:sz w:val="21"/>
+        </w:rPr>
         <w:t>Antes de implementar cache/costos, CoolAgent define una politica estricta de dominio para que el asistente responda como tecnico de refrigeracion general. Esto evita guardar en cache respuestas fuera de alcance o contrarias al rol del producto.</w:t>
       </w:r>
     </w:p>
@@ -4052,6 +4147,9 @@
         <w:pStyle w:val="Heading2"/>
       </w:pPr>
       <w:r>
+        <w:rPr>
+          <w:sz w:val="21"/>
+        </w:rPr>
         <w:t>12.1 Relacion con Fase B</w:t>
       </w:r>
     </w:p>
@@ -4061,6 +4159,9 @@
         <w:spacing w:after="40"/>
       </w:pPr>
       <w:r>
+        <w:rPr>
+          <w:sz w:val="21"/>
+        </w:rPr>
         <w:t>Fase B0 debe quedar antes de cache/costos.</w:t>
       </w:r>
     </w:p>
@@ -4070,6 +4171,9 @@
         <w:spacing w:after="40"/>
       </w:pPr>
       <w:r>
+        <w:rPr>
+          <w:sz w:val="21"/>
+        </w:rPr>
         <w:t>El cache futuro debe incluir la version de politica del prompt en la llave o metadata.</w:t>
       </w:r>
     </w:p>
@@ -4079,7 +4183,224 @@
         <w:spacing w:after="40"/>
       </w:pPr>
       <w:r>
+        <w:rPr>
+          <w:sz w:val="21"/>
+        </w:rPr>
         <w:t>Si cambia el comportamiento del asistente, respuestas cacheadas con politicas anteriores no deben reutilizarse.</w:t>
+      </w:r>
+    </w:p>
+    <w:p>
+      <w:pPr>
+        <w:pStyle w:val="Heading1"/>
+      </w:pPr>
+      <w:r>
+        <w:rPr>
+          <w:sz w:val="21"/>
+        </w:rPr>
+        <w:t>13. Fase B: uso, tokens y cache exacto</w:t>
+      </w:r>
+    </w:p>
+    <w:p>
+      <w:r>
+        <w:rPr>
+          <w:sz w:val="21"/>
+        </w:rPr>
+        <w:t>Esta fase empieza a reducir costo y latencia sin cambiar el comportamiento principal del RAG. La prioridad fue medir uso y cachear solo respuestas exactas cuando la pregunta, el proveedor, el modelo, la version del prompt y el contexto RAG coinciden.</w:t>
+      </w:r>
+    </w:p>
+    <w:tbl>
+      <w:tblPr>
+        <w:tblStyle w:val="TableGrid"/>
+        <w:tblW w:type="auto" w:w="0"/>
+        <w:tblLook w:firstColumn="1" w:firstRow="1" w:lastColumn="0" w:lastRow="0" w:noHBand="0" w:noVBand="1" w:val="04A0"/>
+      </w:tblPr>
+      <w:tblGrid>
+        <w:gridCol w:w="5112"/>
+        <w:gridCol w:w="5112"/>
+      </w:tblGrid>
+      <w:tr>
+        <w:tc>
+          <w:tcPr>
+            <w:tcW w:type="dxa" w:w="5112"/>
+          </w:tcPr>
+          <w:p>
+            <w:r>
+              <w:t>Elemento</w:t>
+            </w:r>
+          </w:p>
+        </w:tc>
+        <w:tc>
+          <w:tcPr>
+            <w:tcW w:type="dxa" w:w="5112"/>
+          </w:tcPr>
+          <w:p>
+            <w:r>
+              <w:t>Decision vigente</w:t>
+            </w:r>
+          </w:p>
+        </w:tc>
+      </w:tr>
+      <w:tr>
+        <w:tc>
+          <w:tcPr>
+            <w:tcW w:type="dxa" w:w="5112"/>
+          </w:tcPr>
+          <w:p>
+            <w:r>
+              <w:t>Migracion</w:t>
+            </w:r>
+          </w:p>
+        </w:tc>
+        <w:tc>
+          <w:tcPr>
+            <w:tcW w:type="dxa" w:w="5112"/>
+          </w:tcPr>
+          <w:p>
+            <w:r>
+              <w:t>Alembic 20260501_0002 crea usage_events para registrar actividad de chat sin tocar knowledge_documents ni knowledge_chunks.</w:t>
+            </w:r>
+          </w:p>
+        </w:tc>
+      </w:tr>
+      <w:tr>
+        <w:tc>
+          <w:tcPr>
+            <w:tcW w:type="dxa" w:w="5112"/>
+          </w:tcPr>
+          <w:p>
+            <w:r>
+              <w:t>Tracking</w:t>
+            </w:r>
+          </w:p>
+        </w:tc>
+        <w:tc>
+          <w:tcPr>
+            <w:tcW w:type="dxa" w:w="5112"/>
+          </w:tcPr>
+          <w:p>
+            <w:r>
+              <w:t>Cada respuesta registra cache_status: miss cuando llama al provider, hit cuando responde desde Redis y blocked cuando DomainGuard corta la consulta.</w:t>
+            </w:r>
+          </w:p>
+        </w:tc>
+      </w:tr>
+      <w:tr>
+        <w:tc>
+          <w:tcPr>
+            <w:tcW w:type="dxa" w:w="5112"/>
+          </w:tcPr>
+          <w:p>
+            <w:r>
+              <w:t>Endpoint</w:t>
+            </w:r>
+          </w:p>
+        </w:tc>
+        <w:tc>
+          <w:tcPr>
+            <w:tcW w:type="dxa" w:w="5112"/>
+          </w:tcPr>
+          <w:p>
+            <w:r>
+              <w:t>GET /api/v1/usage/summary muestra eventos, tokens de entrada/salida, cache hits/misses y bloqueos de dominio.</w:t>
+            </w:r>
+          </w:p>
+        </w:tc>
+      </w:tr>
+      <w:tr>
+        <w:tc>
+          <w:tcPr>
+            <w:tcW w:type="dxa" w:w="5112"/>
+          </w:tcPr>
+          <w:p>
+            <w:r>
+              <w:t>Cache exacto</w:t>
+            </w:r>
+          </w:p>
+        </w:tc>
+        <w:tc>
+          <w:tcPr>
+            <w:tcW w:type="dxa" w:w="5112"/>
+          </w:tcPr>
+          <w:p>
+            <w:r>
+              <w:t>Redis guarda respuestas por TTL. La llave incluye provider, modelo, PROMPT_POLICY_VERSION, pregunta normalizada, huella del historial y hash del contexto RAG.</w:t>
+            </w:r>
+          </w:p>
+        </w:tc>
+      </w:tr>
+      <w:tr>
+        <w:tc>
+          <w:tcPr>
+            <w:tcW w:type="dxa" w:w="5112"/>
+          </w:tcPr>
+          <w:p>
+            <w:r>
+              <w:t>Proteccion del RAG</w:t>
+            </w:r>
+          </w:p>
+        </w:tc>
+        <w:tc>
+          <w:tcPr>
+            <w:tcW w:type="dxa" w:w="5112"/>
+          </w:tcPr>
+          <w:p>
+            <w:r>
+              <w:t>Si cambia el contexto recuperado desde la knowledge base, cambia el hash y no se reutiliza una respuesta vieja.</w:t>
+            </w:r>
+          </w:p>
+        </w:tc>
+      </w:tr>
+      <w:tr>
+        <w:tc>
+          <w:tcPr>
+            <w:tcW w:type="dxa" w:w="5112"/>
+          </w:tcPr>
+          <w:p>
+            <w:r>
+              <w:t>Costos</w:t>
+            </w:r>
+          </w:p>
+        </w:tc>
+        <w:tc>
+          <w:tcPr>
+            <w:tcW w:type="dxa" w:w="5112"/>
+          </w:tcPr>
+          <w:p>
+            <w:r>
+              <w:t>No se fija precio por defecto para evitar numeros obsoletos. El endpoint queda listo para estimar costos cuando se configuren precios por millon de tokens.</w:t>
+            </w:r>
+          </w:p>
+        </w:tc>
+      </w:tr>
+      <w:tr>
+        <w:tc>
+          <w:tcPr>
+            <w:tcW w:type="dxa" w:w="5112"/>
+          </w:tcPr>
+          <w:p>
+            <w:r>
+              <w:t>Pendiente de Fase B</w:t>
+            </w:r>
+          </w:p>
+        </w:tc>
+        <w:tc>
+          <w:tcPr>
+            <w:tcW w:type="dxa" w:w="5112"/>
+          </w:tcPr>
+          <w:p>
+            <w:r>
+              <w:t>Cache semantico, invalidacion mas fina por cambios en documentos y politica de cuotas/autenticacion.</w:t>
+            </w:r>
+          </w:p>
+        </w:tc>
+      </w:tr>
+    </w:tbl>
+    <w:p>
+      <w:r>
+        <w:rPr>
+          <w:sz w:val="21"/>
+        </w:rPr>
+        <w:t>Nota para futuro: esta base no significa que se vaya a staging o produccion pronto. Solo deja preparado el camino para crecer con menos riesgo cuando llegue ese momento.</w:t>
       </w:r>
     </w:p>
     <w:sectPr>

</xml_diff>

<commit_message>
feat: invalidate chat cache on knowledge changes
</commit_message>
<xml_diff>
--- a/documentation/CoolAgent_Documentacion_Maestra.docx
+++ b/documentation/CoolAgent_Documentacion_Maestra.docx
@@ -1498,7 +1498,7 @@
           </w:tcPr>
           <w:p>
             <w:r>
-              <w:t>UsageEvent registra tokens, cache hits/misses y bloqueos de dominio. Redis cachea respuestas exactas con TTL e invalidacion por version de prompt, historial y contexto RAG.</w:t>
+              <w:t>UsageEvent registra tokens, cache hits/misses y bloqueos de dominio. Redis cachea respuestas exactas con TTL e invalidacion por version de prompt, historial, contexto RAG y huella global de la knowledge base.</w:t>
             </w:r>
           </w:p>
         </w:tc>
@@ -4323,7 +4323,7 @@
           </w:tcPr>
           <w:p>
             <w:r>
-              <w:t>Redis guarda respuestas por TTL. La llave incluye provider, modelo, PROMPT_POLICY_VERSION, pregunta normalizada, huella del historial y hash del contexto RAG.</w:t>
+              <w:t>Redis guarda respuestas por TTL. La llave incluye provider, modelo, PROMPT_POLICY_VERSION, pregunta normalizada, huella del historial, hash del contexto RAG y huella global de la knowledge base.</w:t>
             </w:r>
           </w:p>
         </w:tc>
@@ -4345,7 +4345,7 @@
           </w:tcPr>
           <w:p>
             <w:r>
-              <w:t>Si cambia el contexto recuperado desde la knowledge base, cambia el hash y no se reutiliza una respuesta vieja.</w:t>
+              <w:t>Si cambia el contexto recuperado o cambia la knowledge base por ingesta/borrado de documentos, cambia la llave y no se reutiliza una respuesta vieja.</w:t>
             </w:r>
           </w:p>
         </w:tc>
@@ -4390,6 +4390,28 @@
           <w:p>
             <w:r>
               <w:t>Cache semantico, invalidacion mas fina por cambios en documentos y politica de cuotas/autenticacion.</w:t>
+            </w:r>
+          </w:p>
+        </w:tc>
+      </w:tr>
+      <w:tr>
+        <w:tc>
+          <w:tcPr>
+            <w:tcW w:type="dxa" w:w="5112"/>
+          </w:tcPr>
+          <w:p>
+            <w:r>
+              <w:t>Huella knowledge base</w:t>
+            </w:r>
+          </w:p>
+        </w:tc>
+        <w:tc>
+          <w:tcPr>
+            <w:tcW w:type="dxa" w:w="5112"/>
+          </w:tcPr>
+          <w:p>
+            <w:r>
+              <w:t>RAGService.knowledge_fingerprint() resume conteos y fechas maximas de documentos/chunks. Cambia al ingerir o borrar material RAG y evita reutilizar cache viejo.</w:t>
             </w:r>
           </w:p>
         </w:tc>

</xml_diff>

<commit_message>
feat: track estimated usage costs
</commit_message>
<xml_diff>
--- a/documentation/CoolAgent_Documentacion_Maestra.docx
+++ b/documentation/CoolAgent_Documentacion_Maestra.docx
@@ -676,7 +676,7 @@
           </w:tcPr>
           <w:p>
             <w:r>
-              <w:t>Parcial implementado en Fase B: tabla usage_events, endpoint de resumen y cache exacto con Redis. Queda pendiente cache semantico y politica fina de costos.</w:t>
+              <w:t>Parcial implementado en Fase B: usage_events, endpoint de resumen, cache exacto con Redis, costos estimados configurables y ahorro estimado por cache. Queda pendiente cache semantico solo si el ahorro real lo justifica.</w:t>
             </w:r>
           </w:p>
         </w:tc>
@@ -1498,7 +1498,7 @@
           </w:tcPr>
           <w:p>
             <w:r>
-              <w:t>UsageEvent registra tokens, cache hits/misses y bloqueos de dominio. Redis cachea respuestas exactas con TTL e invalidacion por version de prompt, historial, contexto RAG y huella global de la knowledge base.</w:t>
+              <w:t>UsageEvent registra tokens, costos estimados, ahorro estimado por cache, cache hits/misses y bloqueos de dominio. Redis cachea respuestas exactas con TTL e invalidacion por version de prompt, historial, contexto RAG y huella global de la knowledge base.</w:t>
             </w:r>
           </w:p>
         </w:tc>
@@ -4389,7 +4389,7 @@
           </w:tcPr>
           <w:p>
             <w:r>
-              <w:t>Cache semantico, invalidacion mas fina por cambios en documentos y politica de cuotas/autenticacion.</w:t>
+              <w:t>Cache semantico se pospone hasta comprobar ahorro real suficiente. Tambien quedan pendientes cuotas/autenticacion para uso multiusuario.</w:t>
             </w:r>
           </w:p>
         </w:tc>
@@ -4412,6 +4412,116 @@
           <w:p>
             <w:r>
               <w:t>RAGService.knowledge_fingerprint() resume conteos y fechas maximas de documentos/chunks. Cambia al ingerir o borrar material RAG y evita reutilizar cache viejo.</w:t>
+            </w:r>
+          </w:p>
+        </w:tc>
+      </w:tr>
+      <w:tr>
+        <w:tc>
+          <w:tcPr>
+            <w:tcW w:type="dxa" w:w="5112"/>
+          </w:tcPr>
+          <w:p>
+            <w:r>
+              <w:t>Costos estimados</w:t>
+            </w:r>
+          </w:p>
+        </w:tc>
+        <w:tc>
+          <w:tcPr>
+            <w:tcW w:type="dxa" w:w="5112"/>
+          </w:tcPr>
+          <w:p>
+            <w:r>
+              <w:t>Alembic 20260501_0003 agrega estimated_cost_usd por evento. Los costos son aproximados y dependen de precios configurados, no de facturacion oficial.</w:t>
+            </w:r>
+          </w:p>
+        </w:tc>
+      </w:tr>
+      <w:tr>
+        <w:tc>
+          <w:tcPr>
+            <w:tcW w:type="dxa" w:w="5112"/>
+          </w:tcPr>
+          <w:p>
+            <w:r>
+              <w:t>Ahorro por cache</w:t>
+            </w:r>
+          </w:p>
+        </w:tc>
+        <w:tc>
+          <w:tcPr>
+            <w:tcW w:type="dxa" w:w="5112"/>
+          </w:tcPr>
+          <w:p>
+            <w:r>
+              <w:t>Los cache hits registran cache_saved_tokens_* y cache_saved_cost_usd usando los tokens de la respuesta original cacheada.</w:t>
+            </w:r>
+          </w:p>
+        </w:tc>
+      </w:tr>
+      <w:tr>
+        <w:tc>
+          <w:tcPr>
+            <w:tcW w:type="dxa" w:w="5112"/>
+          </w:tcPr>
+          <w:p>
+            <w:r>
+              <w:t>Filtros usage</w:t>
+            </w:r>
+          </w:p>
+        </w:tc>
+        <w:tc>
+          <w:tcPr>
+            <w:tcW w:type="dxa" w:w="5112"/>
+          </w:tcPr>
+          <w:p>
+            <w:r>
+              <w:t>GET /api/v1/usage/summary acepta conversation_id, date_from, date_to y model para revisar uso por conversacion, rango de tiempo o modelo.</w:t>
+            </w:r>
+          </w:p>
+        </w:tc>
+      </w:tr>
+      <w:tr>
+        <w:tc>
+          <w:tcPr>
+            <w:tcW w:type="dxa" w:w="5112"/>
+          </w:tcPr>
+          <w:p>
+            <w:r>
+              <w:t>Configuracion de precios</w:t>
+            </w:r>
+          </w:p>
+        </w:tc>
+        <w:tc>
+          <w:tcPr>
+            <w:tcW w:type="dxa" w:w="5112"/>
+          </w:tcPr>
+          <w:p>
+            <w:r>
+              <w:t>Se puede usar USAGE_PRICING_JSON para proveedor/modelo o variables simples USAGE_INPUT_COST_PER_MILLION_USD y USAGE_OUTPUT_COST_PER_MILLION_USD.</w:t>
+            </w:r>
+          </w:p>
+        </w:tc>
+      </w:tr>
+      <w:tr>
+        <w:tc>
+          <w:tcPr>
+            <w:tcW w:type="dxa" w:w="5112"/>
+          </w:tcPr>
+          <w:p>
+            <w:r>
+              <w:t>Sin cache semantico</w:t>
+            </w:r>
+          </w:p>
+        </w:tc>
+        <w:tc>
+          <w:tcPr>
+            <w:tcW w:type="dxa" w:w="5112"/>
+          </w:tcPr>
+          <w:p>
+            <w:r>
+              <w:t>Se mantiene fuera por ahora. Solo se evaluara si el ahorro real justifica el riesgo y la complejidad.</w:t>
             </w:r>
           </w:p>
         </w:tc>

</xml_diff>

<commit_message>
docs: defer rate limiting until monetization planning
</commit_message>
<xml_diff>
--- a/documentation/CoolAgent_Documentacion_Maestra.docx
+++ b/documentation/CoolAgent_Documentacion_Maestra.docx
@@ -604,16 +604,8 @@
             <w:shd w:fill="FFF2CC"/>
           </w:tcPr>
           <w:p>
-            <w:pPr>
-              <w:jc w:val="left"/>
-            </w:pPr>
-            <w:r/>
             <w:r>
-              <w:rPr>
-                <w:b w:val="0"/>
-                <w:sz w:val="18"/>
-              </w:rPr>
-              <w:t>Pendiente: aparecen en requerimientos, no estan implementados.</w:t>
+              <w:t>Pendiente: aparecen en requerimientos, no estan implementados. Rate limiting se pospone hasta definir usuarios, planes y monetizacion.</w:t>
             </w:r>
           </w:p>
         </w:tc>
@@ -1106,7 +1098,7 @@
           </w:tcPr>
           <w:p>
             <w:r>
-              <w:t>Funciona con Claude, RAG, prompt versionado, DomainGuard y cache exacto. Falta streaming, autenticacion, cuotas y UX final.</w:t>
+              <w:t>Funciona con Claude, RAG, prompt versionado, DomainGuard, cache exacto y monitoreo de costos. Falta streaming, autenticacion, cuotas/rate limiting ligados a usuarios y UX final.</w:t>
             </w:r>
           </w:p>
         </w:tc>
@@ -2595,7 +2587,7 @@
           </w:tcPr>
           <w:p>
             <w:r>
-              <w:t>Implementado tracking de uso/tokens y cache exacto con Redis. Pendiente cache semantico, invalidacion avanzada y precios configurables.</w:t>
+              <w:t>Implementado tracking de uso/tokens, cache exacto con Redis, invalidacion por knowledge base y costos configurables. Pendiente cache semantico solo si el ahorro real lo justifica; rate limiting queda para la fase de usuarios/monetizacion.</w:t>
             </w:r>
           </w:p>
         </w:tc>
@@ -4389,7 +4381,7 @@
           </w:tcPr>
           <w:p>
             <w:r>
-              <w:t>Cache semantico se pospone hasta comprobar ahorro real suficiente. Tambien quedan pendientes cuotas/autenticacion para uso multiusuario.</w:t>
+              <w:t>Cache semantico se pospone hasta comprobar ahorro real suficiente. Tambien quedan pendientes autenticacion, usuarios, cuotas/rate limiting y costo por usuario para monetizacion.</w:t>
             </w:r>
           </w:p>
         </w:tc>
@@ -4522,6 +4514,50 @@
           <w:p>
             <w:r>
               <w:t>Se mantiene fuera por ahora. Solo se evaluara si el ahorro real justifica el riesgo y la complejidad.</w:t>
+            </w:r>
+          </w:p>
+        </w:tc>
+      </w:tr>
+      <w:tr>
+        <w:tc>
+          <w:tcPr>
+            <w:tcW w:type="dxa" w:w="5112"/>
+          </w:tcPr>
+          <w:p>
+            <w:r>
+              <w:t>Rate limiting pendiente</w:t>
+            </w:r>
+          </w:p>
+        </w:tc>
+        <w:tc>
+          <w:tcPr>
+            <w:tcW w:type="dxa" w:w="5112"/>
+          </w:tcPr>
+          <w:p>
+            <w:r>
+              <w:t>No se implementa ahora. Se debe disenar mas adelante junto con autenticacion, usuarios, planes, costo por usuario y estrategia de monetizacion para evitar rehacerlo.</w:t>
+            </w:r>
+          </w:p>
+        </w:tc>
+      </w:tr>
+      <w:tr>
+        <w:tc>
+          <w:tcPr>
+            <w:tcW w:type="dxa" w:w="5112"/>
+          </w:tcPr>
+          <w:p>
+            <w:r>
+              <w:t>Alcance futuro de cuotas</w:t>
+            </w:r>
+          </w:p>
+        </w:tc>
+        <w:tc>
+          <w:tcPr>
+            <w:tcW w:type="dxa" w:w="5112"/>
+          </w:tcPr>
+          <w:p>
+            <w:r>
+              <w:t>Cuando se retome, deberia cubrir chat, vision, ingesta RAG y busqueda con contadores Redis, respuesta 429 y reportes por usuario/modelo/conversacion.</w:t>
             </w:r>
           </w:p>
         </w:tc>

</xml_diff>

<commit_message>
feat: add websocket chat streaming
</commit_message>
<xml_diff>
--- a/documentation/CoolAgent_Documentacion_Maestra.docx
+++ b/documentation/CoolAgent_Documentacion_Maestra.docx
@@ -1098,7 +1098,7 @@
           </w:tcPr>
           <w:p>
             <w:r>
-              <w:t>Funciona con Claude, RAG, prompt versionado, DomainGuard, cache exacto y monitoreo de costos. Falta streaming, autenticacion, cuotas/rate limiting ligados a usuarios y UX final.</w:t>
+              <w:t>Funciona con Claude, RAG, prompt versionado, DomainGuard, cache exacto, monitoreo de costos y streaming WebSocket. Falta autenticacion, cuotas/rate limiting ligados a usuarios y UX final.</w:t>
             </w:r>
           </w:p>
         </w:tc>
@@ -2397,6 +2397,38 @@
           </w:p>
         </w:tc>
       </w:tr>
+      <w:tr>
+        <w:tc>
+          <w:tcPr>
+            <w:tcW w:type="dxa" w:w="3408"/>
+          </w:tcPr>
+          <w:p>
+            <w:r>
+              <w:t>Chat</w:t>
+            </w:r>
+          </w:p>
+        </w:tc>
+        <w:tc>
+          <w:tcPr>
+            <w:tcW w:type="dxa" w:w="3408"/>
+          </w:tcPr>
+          <w:p>
+            <w:r>
+              <w:t>WebSocket /api/v1/chat/conversations/{conversation_id}/messages/stream</w:t>
+            </w:r>
+          </w:p>
+        </w:tc>
+        <w:tc>
+          <w:tcPr>
+            <w:tcW w:type="dxa" w:w="3408"/>
+          </w:tcPr>
+          <w:p>
+            <w:r>
+              <w:t>Actual: streaming de respuesta con eventos delta/done/error.</w:t>
+            </w:r>
+          </w:p>
+        </w:tc>
+      </w:tr>
     </w:tbl>
     <w:p/>
     <w:p>
@@ -2587,7 +2619,7 @@
           </w:tcPr>
           <w:p>
             <w:r>
-              <w:t>Implementado tracking de uso/tokens, cache exacto con Redis, invalidacion por knowledge base y costos configurables. Pendiente cache semantico solo si el ahorro real lo justifica; rate limiting queda para la fase de usuarios/monetizacion.</w:t>
+              <w:t>Implementado tracking de uso/tokens, cache exacto con Redis, invalidacion por knowledge base, costos configurables y streaming WebSocket. Pendiente cache semantico solo si el ahorro real lo justifica; rate limiting queda para la fase de usuarios/monetizacion.</w:t>
             </w:r>
           </w:p>
         </w:tc>
@@ -4571,6 +4603,228 @@
         <w:t>Nota para futuro: esta base no significa que se vaya a staging o produccion pronto. Solo deja preparado el camino para crecer con menos riesgo cuando llegue ese momento.</w:t>
       </w:r>
     </w:p>
+    <w:p>
+      <w:pPr>
+        <w:pStyle w:val="Heading1"/>
+      </w:pPr>
+      <w:r>
+        <w:t>14. Fase C: streaming WebSocket</w:t>
+      </w:r>
+    </w:p>
+    <w:p>
+      <w:r>
+        <w:t>Fase C agrega streaming de chat para mejorar la experiencia del usuario. En vez de esperar la respuesta completa, el backend envia fragmentos de texto mientras el provider genera la respuesta.</w:t>
+      </w:r>
+    </w:p>
+    <w:tbl>
+      <w:tblPr>
+        <w:tblStyle w:val="TableGrid"/>
+        <w:tblW w:type="auto" w:w="0"/>
+        <w:tblLook w:firstColumn="1" w:firstRow="1" w:lastColumn="0" w:lastRow="0" w:noHBand="0" w:noVBand="1" w:val="04A0"/>
+      </w:tblPr>
+      <w:tblGrid>
+        <w:gridCol w:w="5112"/>
+        <w:gridCol w:w="5112"/>
+      </w:tblGrid>
+      <w:tr>
+        <w:tc>
+          <w:tcPr>
+            <w:tcW w:type="dxa" w:w="5112"/>
+          </w:tcPr>
+          <w:p>
+            <w:r>
+              <w:t>Elemento</w:t>
+            </w:r>
+          </w:p>
+        </w:tc>
+        <w:tc>
+          <w:tcPr>
+            <w:tcW w:type="dxa" w:w="5112"/>
+          </w:tcPr>
+          <w:p>
+            <w:r>
+              <w:t>Decision vigente</w:t>
+            </w:r>
+          </w:p>
+        </w:tc>
+      </w:tr>
+      <w:tr>
+        <w:tc>
+          <w:tcPr>
+            <w:tcW w:type="dxa" w:w="5112"/>
+          </w:tcPr>
+          <w:p>
+            <w:r>
+              <w:t>Endpoint</w:t>
+            </w:r>
+          </w:p>
+        </w:tc>
+        <w:tc>
+          <w:tcPr>
+            <w:tcW w:type="dxa" w:w="5112"/>
+          </w:tcPr>
+          <w:p>
+            <w:r>
+              <w:t>WebSocket /api/v1/chat/conversations/{conversation_id}/messages/stream</w:t>
+            </w:r>
+          </w:p>
+        </w:tc>
+      </w:tr>
+      <w:tr>
+        <w:tc>
+          <w:tcPr>
+            <w:tcW w:type="dxa" w:w="5112"/>
+          </w:tcPr>
+          <w:p>
+            <w:r>
+              <w:t>Entrada</w:t>
+            </w:r>
+          </w:p>
+        </w:tc>
+        <w:tc>
+          <w:tcPr>
+            <w:tcW w:type="dxa" w:w="5112"/>
+          </w:tcPr>
+          <w:p>
+            <w:r>
+              <w:t>El cliente envia un JSON inicial con content usando el mismo schema ChatMessageRequest.</w:t>
+            </w:r>
+          </w:p>
+        </w:tc>
+      </w:tr>
+      <w:tr>
+        <w:tc>
+          <w:tcPr>
+            <w:tcW w:type="dxa" w:w="5112"/>
+          </w:tcPr>
+          <w:p>
+            <w:r>
+              <w:t>Eventos</w:t>
+            </w:r>
+          </w:p>
+        </w:tc>
+        <w:tc>
+          <w:tcPr>
+            <w:tcW w:type="dxa" w:w="5112"/>
+          </w:tcPr>
+          <w:p>
+            <w:r>
+              <w:t>delta envia fragmentos de texto, done envia metadata final y error reporta payload invalido o conversacion no encontrada.</w:t>
+            </w:r>
+          </w:p>
+        </w:tc>
+      </w:tr>
+      <w:tr>
+        <w:tc>
+          <w:tcPr>
+            <w:tcW w:type="dxa" w:w="5112"/>
+          </w:tcPr>
+          <w:p>
+            <w:r>
+              <w:t>Orden del flujo</w:t>
+            </w:r>
+          </w:p>
+        </w:tc>
+        <w:tc>
+          <w:tcPr>
+            <w:tcW w:type="dxa" w:w="5112"/>
+          </w:tcPr>
+          <w:p>
+            <w:r>
+              <w:t>DomainGuard -&gt; RAG -&gt; cache exacto -&gt; provider stream -&gt; persistencia -&gt; usage/costos.</w:t>
+            </w:r>
+          </w:p>
+        </w:tc>
+      </w:tr>
+      <w:tr>
+        <w:tc>
+          <w:tcPr>
+            <w:tcW w:type="dxa" w:w="5112"/>
+          </w:tcPr>
+          <w:p>
+            <w:r>
+              <w:t>Cache</w:t>
+            </w:r>
+          </w:p>
+        </w:tc>
+        <w:tc>
+          <w:tcPr>
+            <w:tcW w:type="dxa" w:w="5112"/>
+          </w:tcPr>
+          <w:p>
+            <w:r>
+              <w:t>Si hay cache hit, responde por WebSocket sin llamar a Claude y registra ahorro estimado.</w:t>
+            </w:r>
+          </w:p>
+        </w:tc>
+      </w:tr>
+      <w:tr>
+        <w:tc>
+          <w:tcPr>
+            <w:tcW w:type="dxa" w:w="5112"/>
+          </w:tcPr>
+          <w:p>
+            <w:r>
+              <w:t>Persistencia</w:t>
+            </w:r>
+          </w:p>
+        </w:tc>
+        <w:tc>
+          <w:tcPr>
+            <w:tcW w:type="dxa" w:w="5112"/>
+          </w:tcPr>
+          <w:p>
+            <w:r>
+              <w:t>Al terminar el stream se guarda el mensaje completo del asistente, se actualiza cache y se registra usage.</w:t>
+            </w:r>
+          </w:p>
+        </w:tc>
+      </w:tr>
+      <w:tr>
+        <w:tc>
+          <w:tcPr>
+            <w:tcW w:type="dxa" w:w="5112"/>
+          </w:tcPr>
+          <w:p>
+            <w:r>
+              <w:t>Tokens</w:t>
+            </w:r>
+          </w:p>
+        </w:tc>
+        <w:tc>
+          <w:tcPr>
+            <w:tcW w:type="dxa" w:w="5112"/>
+          </w:tcPr>
+          <w:p>
+            <w:r>
+              <w:t>ClaudeProvider.chat_stream captura metadata final de tokens cuando Anthropic la envia. Si un provider no la envia, tokens quedan en cero para evitar inventar costos.</w:t>
+            </w:r>
+          </w:p>
+        </w:tc>
+      </w:tr>
+      <w:tr>
+        <w:tc>
+          <w:tcPr>
+            <w:tcW w:type="dxa" w:w="5112"/>
+          </w:tcPr>
+          <w:p>
+            <w:r>
+              <w:t>Tests</w:t>
+            </w:r>
+          </w:p>
+        </w:tc>
+        <w:tc>
+          <w:tcPr>
+            <w:tcW w:type="dxa" w:w="5112"/>
+          </w:tcPr>
+          <w:p>
+            <w:r>
+              <w:t>Cobertura unit para servicio y router WebSocket sin llamar a Claude real.</w:t>
+            </w:r>
+          </w:p>
+        </w:tc>
+      </w:tr>
+    </w:tbl>
     <w:sectPr>
       <w:footerReference w:type="default" r:id="rId9"/>
       <w:pgSz w:w="12240" w:h="15840"/>

</xml_diff>

<commit_message>
feat: add technical cases context management
</commit_message>
<xml_diff>
--- a/documentation/CoolAgent_Documentacion_Maestra.docx
+++ b/documentation/CoolAgent_Documentacion_Maestra.docx
@@ -332,17 +332,8 @@
             <w:vAlign w:val="center"/>
           </w:tcPr>
           <w:p>
-            <w:pPr>
-              <w:jc w:val="left"/>
-            </w:pPr>
-            <w:r/>
             <w:r>
-              <w:rPr>
-                <w:b/>
-                <w:color w:val="FFFFFF"/>
-                <w:sz w:val="18"/>
-              </w:rPr>
-              <w:t>Estado actual al 30/04/2026</w:t>
+              <w:t>Estado actual al 01/05/2026</w:t>
             </w:r>
           </w:p>
         </w:tc>
@@ -449,7 +440,7 @@
           </w:tcPr>
           <w:p>
             <w:r>
-              <w:t>Implementado con conversaciones persistidas, provider Claude, prompt de refrigeracion general, DomainGuard, RAG, cache exacto y tracking de uso/tokens.</w:t>
+              <w:t>Implementado con TechnicalCase/casos tecnicos, provider Claude, prompt de refrigeracion general, DomainGuard, RAG, cache exacto, tracking de uso/tokens, streaming WebSocket y compactacion de contexto.</w:t>
             </w:r>
           </w:p>
         </w:tc>
@@ -668,7 +659,7 @@
           </w:tcPr>
           <w:p>
             <w:r>
-              <w:t>Parcial implementado en Fase B: usage_events, endpoint de resumen, cache exacto con Redis, costos estimados configurables y ahorro estimado por cache. Queda pendiente cache semantico solo si el ahorro real lo justifica.</w:t>
+              <w:t>Parcial implementado en Fase B y C2: usage_events, endpoint de resumen, cache exacto con Redis, costos estimados configurables, ahorro estimado por cache y llaves ligadas al caso tecnico/contexto. Queda pendiente cache semantico solo si el ahorro real lo justifica.</w:t>
             </w:r>
           </w:p>
         </w:tc>
@@ -1034,15 +1025,7 @@
             <w:shd w:fill="D9EAD3"/>
           </w:tcPr>
           <w:p>
-            <w:pPr>
-              <w:jc w:val="left"/>
-            </w:pPr>
-            <w:r/>
             <w:r>
-              <w:rPr>
-                <w:b w:val="0"/>
-                <w:sz w:val="18"/>
-              </w:rPr>
               <w:t>Completado probado</w:t>
             </w:r>
           </w:p>
@@ -1053,16 +1036,8 @@
             <w:vAlign w:val="center"/>
           </w:tcPr>
           <w:p>
-            <w:pPr>
-              <w:jc w:val="left"/>
-            </w:pPr>
-            <w:r/>
             <w:r>
-              <w:rPr>
-                <w:b w:val="0"/>
-                <w:sz w:val="18"/>
-              </w:rPr>
-              <w:t>Endpoints para upload PDF/text, listado, busqueda y borrado. Falta migracion formal y tests.</w:t>
+              <w:t>Endpoints para upload PDF/text, listado, busqueda, glosario y borrado. Alembic y tests robustos quedan como base oficial.</w:t>
             </w:r>
           </w:p>
         </w:tc>
@@ -1087,7 +1062,7 @@
           </w:tcPr>
           <w:p>
             <w:r>
-              <w:t>Completado parcial</w:t>
+              <w:t>Completado funcional</w:t>
             </w:r>
           </w:p>
         </w:tc>
@@ -1098,7 +1073,7 @@
           </w:tcPr>
           <w:p>
             <w:r>
-              <w:t>Funciona con Claude, RAG, prompt versionado, DomainGuard, cache exacto, monitoreo de costos y streaming WebSocket. Falta autenticacion, cuotas/rate limiting ligados a usuarios y UX final.</w:t>
+              <w:t>El dominio oficial es TechnicalCase: lista de casos, mensajes por caso, metadata opcional, streaming, RAG, DomainGuard, cache exacto y compactacion de contexto. Falta UX final, auth y cuotas ligadas a usuarios.</w:t>
             </w:r>
           </w:p>
         </w:tc>
@@ -1269,16 +1244,8 @@
             <w:vAlign w:val="center"/>
           </w:tcPr>
           <w:p>
-            <w:pPr>
-              <w:jc w:val="left"/>
-            </w:pPr>
-            <w:r/>
             <w:r>
-              <w:rPr>
-                <w:b w:val="0"/>
-                <w:sz w:val="18"/>
-              </w:rPr>
-              <w:t>No iniciar como prioridad hasta cerrar milestone RAG y ordenar docs.</w:t>
+              <w:t>No usar un chat central infinito. El frontend recomendado es lista de casos tecnicos + chat activo + panel editable de metadata.</w:t>
             </w:r>
           </w:p>
         </w:tc>
@@ -1490,7 +1457,7 @@
           </w:tcPr>
           <w:p>
             <w:r>
-              <w:t>UsageEvent registra tokens, costos estimados, ahorro estimado por cache, cache hits/misses y bloqueos de dominio. Redis cachea respuestas exactas con TTL e invalidacion por version de prompt, historial, contexto RAG y huella global de la knowledge base.</w:t>
+              <w:t>UsageEvent registra tokens, costos estimados, ahorro por cache, cache hits/misses, bloqueos de dominio y compactaciones de contexto. Redis cachea respuestas exactas con TTL e invalidacion por version de prompt, caso tecnico, resumen/contexto, RAG y huella global de la knowledge base.</w:t>
             </w:r>
           </w:p>
         </w:tc>
@@ -1731,16 +1698,8 @@
             <w:vAlign w:val="center"/>
           </w:tcPr>
           <w:p>
-            <w:pPr>
-              <w:jc w:val="left"/>
-            </w:pPr>
-            <w:r/>
             <w:r>
-              <w:rPr>
-                <w:b w:val="0"/>
-                <w:sz w:val="18"/>
-              </w:rPr>
-              <w:t>POST /api/v1/chat/conversations</w:t>
+              <w:t>POST /api/v1/chat/cases</w:t>
             </w:r>
           </w:p>
         </w:tc>
@@ -1751,16 +1710,8 @@
             <w:shd w:fill="D9EAD3"/>
           </w:tcPr>
           <w:p>
-            <w:pPr>
-              <w:jc w:val="left"/>
-            </w:pPr>
-            <w:r/>
             <w:r>
-              <w:rPr>
-                <w:b w:val="0"/>
-                <w:sz w:val="18"/>
-              </w:rPr>
-              <w:t>Actual</w:t>
+              <w:t>Actual oficial: crea caso tecnico con metadata opcional</w:t>
             </w:r>
           </w:p>
         </w:tc>
@@ -1791,16 +1742,8 @@
             <w:vAlign w:val="center"/>
           </w:tcPr>
           <w:p>
-            <w:pPr>
-              <w:jc w:val="left"/>
-            </w:pPr>
-            <w:r/>
             <w:r>
-              <w:rPr>
-                <w:b w:val="0"/>
-                <w:sz w:val="18"/>
-              </w:rPr>
-              <w:t>POST /api/v1/chat/conversations/{conversation_id}/messages</w:t>
+              <w:t>POST /api/v1/chat/cases/{case_id}/messages</w:t>
             </w:r>
           </w:p>
         </w:tc>
@@ -1811,16 +1754,8 @@
             <w:shd w:fill="D9EAD3"/>
           </w:tcPr>
           <w:p>
-            <w:pPr>
-              <w:jc w:val="left"/>
-            </w:pPr>
-            <w:r/>
             <w:r>
-              <w:rPr>
-                <w:b w:val="0"/>
-                <w:sz w:val="18"/>
-              </w:rPr>
-              <w:t>Actual con RAG</w:t>
+              <w:t>Actual oficial con DomainGuard, contexto de caso, RAG y cache exacto</w:t>
             </w:r>
           </w:p>
         </w:tc>
@@ -2414,6 +2349,230 @@
           </w:tcPr>
           <w:p>
             <w:r>
+              <w:t>WebSocket /api/v1/chat/cases/{case_id}/messages/stream</w:t>
+            </w:r>
+          </w:p>
+        </w:tc>
+        <w:tc>
+          <w:tcPr>
+            <w:tcW w:type="dxa" w:w="3408"/>
+          </w:tcPr>
+          <w:p>
+            <w:r>
+              <w:t>Actual oficial: streaming de respuesta con eventos delta/done/error</w:t>
+            </w:r>
+          </w:p>
+        </w:tc>
+      </w:tr>
+      <w:tr>
+        <w:tc>
+          <w:tcPr>
+            <w:tcW w:type="dxa" w:w="3408"/>
+          </w:tcPr>
+          <w:p>
+            <w:r>
+              <w:t>Chat</w:t>
+            </w:r>
+          </w:p>
+        </w:tc>
+        <w:tc>
+          <w:tcPr>
+            <w:tcW w:type="dxa" w:w="3408"/>
+          </w:tcPr>
+          <w:p>
+            <w:r>
+              <w:t>GET /api/v1/chat/cases</w:t>
+            </w:r>
+          </w:p>
+        </w:tc>
+        <w:tc>
+          <w:tcPr>
+            <w:tcW w:type="dxa" w:w="3408"/>
+          </w:tcPr>
+          <w:p>
+            <w:r>
+              <w:t>Actual oficial: lista casos con metadata y last_message_at</w:t>
+            </w:r>
+          </w:p>
+        </w:tc>
+      </w:tr>
+      <w:tr>
+        <w:tc>
+          <w:tcPr>
+            <w:tcW w:type="dxa" w:w="3408"/>
+          </w:tcPr>
+          <w:p>
+            <w:r>
+              <w:t>Chat</w:t>
+            </w:r>
+          </w:p>
+        </w:tc>
+        <w:tc>
+          <w:tcPr>
+            <w:tcW w:type="dxa" w:w="3408"/>
+          </w:tcPr>
+          <w:p>
+            <w:r>
+              <w:t>GET /api/v1/chat/cases/{case_id}</w:t>
+            </w:r>
+          </w:p>
+        </w:tc>
+        <w:tc>
+          <w:tcPr>
+            <w:tcW w:type="dxa" w:w="3408"/>
+          </w:tcPr>
+          <w:p>
+            <w:r>
+              <w:t>Actual oficial: detalle de caso tecnico</w:t>
+            </w:r>
+          </w:p>
+        </w:tc>
+      </w:tr>
+      <w:tr>
+        <w:tc>
+          <w:tcPr>
+            <w:tcW w:type="dxa" w:w="3408"/>
+          </w:tcPr>
+          <w:p>
+            <w:r>
+              <w:t>Chat</w:t>
+            </w:r>
+          </w:p>
+        </w:tc>
+        <w:tc>
+          <w:tcPr>
+            <w:tcW w:type="dxa" w:w="3408"/>
+          </w:tcPr>
+          <w:p>
+            <w:r>
+              <w:t>PATCH /api/v1/chat/cases/{case_id}</w:t>
+            </w:r>
+          </w:p>
+        </w:tc>
+        <w:tc>
+          <w:tcPr>
+            <w:tcW w:type="dxa" w:w="3408"/>
+          </w:tcPr>
+          <w:p>
+            <w:r>
+              <w:t>Actual oficial: actualiza titulo, fabricante, modelo, categoria o estado</w:t>
+            </w:r>
+          </w:p>
+        </w:tc>
+      </w:tr>
+      <w:tr>
+        <w:tc>
+          <w:tcPr>
+            <w:tcW w:type="dxa" w:w="3408"/>
+          </w:tcPr>
+          <w:p>
+            <w:r>
+              <w:t>Chat</w:t>
+            </w:r>
+          </w:p>
+        </w:tc>
+        <w:tc>
+          <w:tcPr>
+            <w:tcW w:type="dxa" w:w="3408"/>
+          </w:tcPr>
+          <w:p>
+            <w:r>
+              <w:t>GET /api/v1/chat/cases/{case_id}/messages</w:t>
+            </w:r>
+          </w:p>
+        </w:tc>
+        <w:tc>
+          <w:tcPr>
+            <w:tcW w:type="dxa" w:w="3408"/>
+          </w:tcPr>
+          <w:p>
+            <w:r>
+              <w:t>Actual oficial: mensajes paginados por caso</w:t>
+            </w:r>
+          </w:p>
+        </w:tc>
+      </w:tr>
+      <w:tr>
+        <w:tc>
+          <w:tcPr>
+            <w:tcW w:type="dxa" w:w="3408"/>
+          </w:tcPr>
+          <w:p>
+            <w:r>
+              <w:t>Chat legacy</w:t>
+            </w:r>
+          </w:p>
+        </w:tc>
+        <w:tc>
+          <w:tcPr>
+            <w:tcW w:type="dxa" w:w="3408"/>
+          </w:tcPr>
+          <w:p>
+            <w:r>
+              <w:t>POST /api/v1/chat/conversations</w:t>
+            </w:r>
+          </w:p>
+        </w:tc>
+        <w:tc>
+          <w:tcPr>
+            <w:tcW w:type="dxa" w:w="3408"/>
+          </w:tcPr>
+          <w:p>
+            <w:r>
+              <w:t>Alias temporal de /cases; deprecado internamente</w:t>
+            </w:r>
+          </w:p>
+        </w:tc>
+      </w:tr>
+      <w:tr>
+        <w:tc>
+          <w:tcPr>
+            <w:tcW w:type="dxa" w:w="3408"/>
+          </w:tcPr>
+          <w:p>
+            <w:r>
+              <w:t>Chat legacy</w:t>
+            </w:r>
+          </w:p>
+        </w:tc>
+        <w:tc>
+          <w:tcPr>
+            <w:tcW w:type="dxa" w:w="3408"/>
+          </w:tcPr>
+          <w:p>
+            <w:r>
+              <w:t>POST /api/v1/chat/conversations/{conversation_id}/messages</w:t>
+            </w:r>
+          </w:p>
+        </w:tc>
+        <w:tc>
+          <w:tcPr>
+            <w:tcW w:type="dxa" w:w="3408"/>
+          </w:tcPr>
+          <w:p>
+            <w:r>
+              <w:t>Alias temporal hacia /cases/{case_id}/messages</w:t>
+            </w:r>
+          </w:p>
+        </w:tc>
+      </w:tr>
+      <w:tr>
+        <w:tc>
+          <w:tcPr>
+            <w:tcW w:type="dxa" w:w="3408"/>
+          </w:tcPr>
+          <w:p>
+            <w:r>
+              <w:t>Chat legacy</w:t>
+            </w:r>
+          </w:p>
+        </w:tc>
+        <w:tc>
+          <w:tcPr>
+            <w:tcW w:type="dxa" w:w="3408"/>
+          </w:tcPr>
+          <w:p>
+            <w:r>
               <w:t>WebSocket /api/v1/chat/conversations/{conversation_id}/messages/stream</w:t>
             </w:r>
           </w:p>
@@ -2424,7 +2583,7 @@
           </w:tcPr>
           <w:p>
             <w:r>
-              <w:t>Actual: streaming de respuesta con eventos delta/done/error.</w:t>
+              <w:t>Alias temporal hacia streaming por caso</w:t>
             </w:r>
           </w:p>
         </w:tc>
@@ -2619,7 +2778,7 @@
           </w:tcPr>
           <w:p>
             <w:r>
-              <w:t>Implementado tracking de uso/tokens, cache exacto con Redis, invalidacion por knowledge base, costos configurables y streaming WebSocket. Pendiente cache semantico solo si el ahorro real lo justifica; rate limiting queda para la fase de usuarios/monetizacion.</w:t>
+              <w:t>Implementado tracking de uso/tokens, cache exacto con Redis, invalidacion por knowledge base, costos configurables y compatibilidad con casos tecnicos. Pendiente cache semantico solo si el ahorro real lo justifica; rate limiting queda para usuarios/monetizacion.</w:t>
             </w:r>
           </w:p>
         </w:tc>
@@ -2643,7 +2802,7 @@
           </w:tcPr>
           <w:p>
             <w:r>
-              <w:t>WebSocket streaming</w:t>
+              <w:t>Fase C/C2 cerradas</w:t>
             </w:r>
           </w:p>
         </w:tc>
@@ -2654,7 +2813,7 @@
           </w:tcPr>
           <w:p>
             <w:r>
-              <w:t>Mejorar UX del chat con respuesta en tiempo real.</w:t>
+              <w:t>Streaming WebSocket y TechnicalCase implementados. El chat ya se organiza por casos tecnicos con compactacion de contexto.</w:t>
             </w:r>
           </w:p>
         </w:tc>
@@ -2741,10 +2900,7 @@
     </w:p>
     <w:p>
       <w:r>
-        <w:rPr>
-          <w:sz w:val="21"/>
-        </w:rPr>
-        <w:t>Antes de iniciar otra feature, cerrar formalmente el milestone RAG:</w:t>
+        <w:t>Con Fase A, B0, C y C2 cerradas, el siguiente paso recomendado es decidir entre fortalecer codigos de error (Fase D) o iniciar el frontend MVP sobre el contrato oficial de casos tecnicos.</w:t>
       </w:r>
     </w:p>
     <w:p>
@@ -2753,10 +2909,7 @@
         <w:spacing w:after="40"/>
       </w:pPr>
       <w:r>
-        <w:rPr>
-          <w:sz w:val="21"/>
-        </w:rPr>
-        <w:t>Agregar migracion real o estrategia limpia de esquema para pgvector y columnas nuevas.</w:t>
+        <w:t>Si se inicia frontend, la pantalla base debe ser lista de casos tecnicos + chat activo + panel editable de metadata.</w:t>
       </w:r>
     </w:p>
     <w:p>
@@ -2765,10 +2918,7 @@
         <w:spacing w:after="40"/>
       </w:pPr>
       <w:r>
-        <w:rPr>
-          <w:sz w:val="21"/>
-        </w:rPr>
-        <w:t>Agregar tests minimos de RAG: ingesta, busqueda y chat con contexto mockeado.</w:t>
+        <w:t>Si se prioriza Fase D, crear seed inicial de codigos por fabricante/modelo y endpoints reales de busqueda.</w:t>
       </w:r>
     </w:p>
     <w:p>
@@ -2777,10 +2927,7 @@
         <w:spacing w:after="40"/>
       </w:pPr>
       <w:r>
-        <w:rPr>
-          <w:sz w:val="21"/>
-        </w:rPr>
-        <w:t>Limpiar y revisar cambios sin trackear relacionados al RAG.</w:t>
+        <w:t>Mantener /conversations solo como alias temporal; la API oficial nueva es /cases.</w:t>
       </w:r>
     </w:p>
     <w:p>
@@ -2789,10 +2936,7 @@
         <w:spacing w:after="40"/>
       </w:pPr>
       <w:r>
-        <w:rPr>
-          <w:sz w:val="21"/>
-        </w:rPr>
-        <w:t>Hacer commit del backend RAG como hito estable.</w:t>
+        <w:t>Rate limiting, cuotas, usuarios y monetizacion siguen pendientes para una fase futura.</w:t>
       </w:r>
     </w:p>
     <w:tbl>
@@ -2813,27 +2957,10 @@
             <w:vAlign w:val="center"/>
           </w:tcPr>
           <w:p>
-            <w:pPr>
-              <w:spacing w:after="80"/>
-            </w:pPr>
             <w:r>
-              <w:rPr>
-                <w:b/>
-                <w:color w:val="17324D"/>
-                <w:sz w:val="20"/>
-              </w:rPr>
               <w:t>Recomendacion de secuencia</w:t>
-            </w:r>
-          </w:p>
-          <w:p>
-            <w:pPr>
-              <w:spacing w:after="0"/>
-            </w:pPr>
-            <w:r>
-              <w:rPr>
-                <w:sz w:val="18"/>
-              </w:rPr>
-              <w:t>No iniciar frontend todavia. El frontend depende de contratos de API y estados de producto; conviene congelar primero el hito RAG y este documento maestro.</w:t>
+              <w:br/>
+              <w:t>Con Fase C2 cerrada, el backend ya tiene un contrato mas estable para chat/RAG: casos tecnicos, metadata opcional, mensajes paginados y streaming. El siguiente paso puede ser Fase D codigos de error o comenzar el frontend MVP consumiendo casos tecnicos. No retomar rate limiting hasta disenar usuarios, planes, costo por usuario y monetizacion.</w:t>
             </w:r>
           </w:p>
         </w:tc>
@@ -3813,24 +3940,10 @@
             <w:shd w:fill="FFF2CC"/>
           </w:tcPr>
           <w:p>
-            <w:pPr>
-              <w:jc w:val="left"/>
-            </w:pPr>
             <w:r>
-              <w:rPr>
-                <w:b/>
-                <w:color w:val="17324D"/>
-                <w:sz w:val="20"/>
-              </w:rPr>
               <w:t>Cuidado con bases ya creadas</w:t>
-            </w:r>
-          </w:p>
-          <w:p>
-            <w:r>
-              <w:rPr>
-                <w:sz w:val="18"/>
-              </w:rPr>
-              <w:t>La base local actual puede tener tablas creadas antes de Alembic. Para una base nueva se usa alembic upgrade head. Para una base local existente, primero se verifica que el schema coincida con la migracion baseline; si coincide, se usa alembic stamp head. No se debe correr upgrade head a ciegas sobre tablas existentes con datos reales.</w:t>
+              <w:br/>
+              <w:t>La base local puede haber tenido tablas creadas antes de Alembic. Para C2 se agrego una migracion de rescate 20260501_0005 que une conversaciones legacy dentro de technical_cases, repara llaves foraneas y conserva mensajes/RAG. A futuro, los cambios de schema deben entrar primero por Alembic.</w:t>
             </w:r>
           </w:p>
         </w:tc>
@@ -4347,7 +4460,7 @@
           </w:tcPr>
           <w:p>
             <w:r>
-              <w:t>Redis guarda respuestas por TTL. La llave incluye provider, modelo, PROMPT_POLICY_VERSION, pregunta normalizada, huella del historial, hash del contexto RAG y huella global de la knowledge base.</w:t>
+              <w:t>Redis guarda respuestas por TTL. La llave incluye provider, modelo, PROMPT_POLICY_VERSION, pregunta normalizada, technical_case_id, fingerprint del resumen/contexto, ultimos mensajes, hash del contexto RAG y huella global de la knowledge base.</w:t>
             </w:r>
           </w:p>
         </w:tc>
@@ -4501,7 +4614,7 @@
           </w:tcPr>
           <w:p>
             <w:r>
-              <w:t>GET /api/v1/usage/summary acepta conversation_id, date_from, date_to y model para revisar uso por conversacion, rango de tiempo o modelo.</w:t>
+              <w:t>GET /api/v1/usage/summary acepta technical_case_id, conversation_id legacy, date_from, date_to y model para revisar uso por caso tecnico, rango de tiempo o modelo.</w:t>
             </w:r>
           </w:p>
         </w:tc>
@@ -4594,6 +4707,28 @@
           </w:p>
         </w:tc>
       </w:tr>
+      <w:tr>
+        <w:tc>
+          <w:tcPr>
+            <w:tcW w:type="dxa" w:w="5112"/>
+          </w:tcPr>
+          <w:p>
+            <w:r>
+              <w:t>Compactacion de contexto</w:t>
+            </w:r>
+          </w:p>
+        </w:tc>
+        <w:tc>
+          <w:tcPr>
+            <w:tcW w:type="dxa" w:w="5112"/>
+          </w:tcPr>
+          <w:p>
+            <w:r>
+              <w:t>Las llamadas de resumen automatico se registran como event_type="context_compaction" para separar ese costo del chat normal.</w:t>
+            </w:r>
+          </w:p>
+        </w:tc>
+      </w:tr>
     </w:tbl>
     <w:p>
       <w:r>
@@ -4665,7 +4800,7 @@
           </w:tcPr>
           <w:p>
             <w:r>
-              <w:t>WebSocket /api/v1/chat/conversations/{conversation_id}/messages/stream</w:t>
+              <w:t>WebSocket /api/v1/chat/cases/{case_id}/messages/stream. El endpoint /conversations/{conversation_id}/messages/stream queda como alias temporal.</w:t>
             </w:r>
           </w:p>
         </w:tc>
@@ -4709,7 +4844,7 @@
           </w:tcPr>
           <w:p>
             <w:r>
-              <w:t>delta envia fragmentos de texto, done envia metadata final y error reporta payload invalido o conversacion no encontrada.</w:t>
+              <w:t>delta envia fragmentos de texto, done envia metadata final y error reporta payload invalido o caso tecnico no encontrado.</w:t>
             </w:r>
           </w:p>
         </w:tc>
@@ -4731,7 +4866,7 @@
           </w:tcPr>
           <w:p>
             <w:r>
-              <w:t>DomainGuard -&gt; RAG -&gt; cache exacto -&gt; provider stream -&gt; persistencia -&gt; usage/costos.</w:t>
+              <w:t>DomainGuard -&gt; contexto del caso -&gt; RAG -&gt; cache exacto -&gt; provider stream -&gt; persistencia -&gt; usage/costos.</w:t>
             </w:r>
           </w:p>
         </w:tc>
@@ -4820,6 +4955,316 @@
           <w:p>
             <w:r>
               <w:t>Cobertura unit para servicio y router WebSocket sin llamar a Claude real.</w:t>
+            </w:r>
+          </w:p>
+        </w:tc>
+      </w:tr>
+      <w:tr>
+        <w:tc>
+          <w:tcPr>
+            <w:tcW w:type="dxa" w:w="5112"/>
+          </w:tcPr>
+          <w:p>
+            <w:r>
+              <w:t>TechnicalCase</w:t>
+            </w:r>
+          </w:p>
+        </w:tc>
+        <w:tc>
+          <w:tcPr>
+            <w:tcW w:type="dxa" w:w="5112"/>
+          </w:tcPr>
+          <w:p>
+            <w:r>
+              <w:t>El stream pertenece a un caso tecnico especifico; no debe modelarse como chat central infinito.</w:t>
+            </w:r>
+          </w:p>
+        </w:tc>
+      </w:tr>
+    </w:tbl>
+    <w:p>
+      <w:pPr>
+        <w:pStyle w:val="Heading1"/>
+      </w:pPr>
+      <w:r>
+        <w:t>15. Fase C2: Technical Cases y contexto robusto</w:t>
+      </w:r>
+    </w:p>
+    <w:p>
+      <w:r>
+        <w:t>Fase C2 reorganiza el chat alrededor de casos tecnicos. Un TechnicalCase representa un equipo, falla o trabajo especifico; dentro de ese caso viven los mensajes, el resumen tecnico y la metadata opcional. Esto evita depender de un chat infinito y prepara una experiencia de producto mas parecida a tickets/casos de soporte y field service.</w:t>
+      </w:r>
+    </w:p>
+    <w:tbl>
+      <w:tblPr>
+        <w:tblStyle w:val="TableGrid"/>
+        <w:tblW w:type="auto" w:w="0"/>
+        <w:tblLook w:firstColumn="1" w:firstRow="1" w:lastColumn="0" w:lastRow="0" w:noHBand="0" w:noVBand="1" w:val="04A0"/>
+      </w:tblPr>
+      <w:tblGrid>
+        <w:gridCol w:w="5112"/>
+        <w:gridCol w:w="5112"/>
+      </w:tblGrid>
+      <w:tr>
+        <w:tc>
+          <w:tcPr>
+            <w:tcW w:type="dxa" w:w="5112"/>
+          </w:tcPr>
+          <w:p>
+            <w:r>
+              <w:t>Elemento</w:t>
+            </w:r>
+          </w:p>
+        </w:tc>
+        <w:tc>
+          <w:tcPr>
+            <w:tcW w:type="dxa" w:w="5112"/>
+          </w:tcPr>
+          <w:p>
+            <w:r>
+              <w:t>Decision vigente</w:t>
+            </w:r>
+          </w:p>
+        </w:tc>
+      </w:tr>
+      <w:tr>
+        <w:tc>
+          <w:tcPr>
+            <w:tcW w:type="dxa" w:w="5112"/>
+          </w:tcPr>
+          <w:p>
+            <w:r>
+              <w:t>Dominio oficial</w:t>
+            </w:r>
+          </w:p>
+        </w:tc>
+        <w:tc>
+          <w:tcPr>
+            <w:tcW w:type="dxa" w:w="5112"/>
+          </w:tcPr>
+          <w:p>
+            <w:r>
+              <w:t>TechnicalCase reemplaza a Conversation en el backend. Conversation queda como alias legacy para compatibilidad temporal.</w:t>
+            </w:r>
+          </w:p>
+        </w:tc>
+      </w:tr>
+      <w:tr>
+        <w:tc>
+          <w:tcPr>
+            <w:tcW w:type="dxa" w:w="5112"/>
+          </w:tcPr>
+          <w:p>
+            <w:r>
+              <w:t>Schema</w:t>
+            </w:r>
+          </w:p>
+        </w:tc>
+        <w:tc>
+          <w:tcPr>
+            <w:tcW w:type="dxa" w:w="5112"/>
+          </w:tcPr>
+          <w:p>
+            <w:r>
+              <w:t>Alembic 20260501_0004 renombra el dominio y agrega metadata/resumen. Alembic 20260501_0005 repara bases locales donde coexistian conversations y technical_cases.</w:t>
+            </w:r>
+          </w:p>
+        </w:tc>
+      </w:tr>
+      <w:tr>
+        <w:tc>
+          <w:tcPr>
+            <w:tcW w:type="dxa" w:w="5112"/>
+          </w:tcPr>
+          <w:p>
+            <w:r>
+              <w:t>Datos conservados</w:t>
+            </w:r>
+          </w:p>
+        </w:tc>
+        <w:tc>
+          <w:tcPr>
+            <w:tcW w:type="dxa" w:w="5112"/>
+          </w:tcPr>
+          <w:p>
+            <w:r>
+              <w:t>Validacion local: 3 casos migrados, 4 mensajes conservados, 1 documento RAG y 1 chunk RAG intactos.</w:t>
+            </w:r>
+          </w:p>
+        </w:tc>
+      </w:tr>
+      <w:tr>
+        <w:tc>
+          <w:tcPr>
+            <w:tcW w:type="dxa" w:w="5112"/>
+          </w:tcPr>
+          <w:p>
+            <w:r>
+              <w:t>API oficial</w:t>
+            </w:r>
+          </w:p>
+        </w:tc>
+        <w:tc>
+          <w:tcPr>
+            <w:tcW w:type="dxa" w:w="5112"/>
+          </w:tcPr>
+          <w:p>
+            <w:r>
+              <w:t>Usar /api/v1/chat/cases y /api/v1/chat/cases/{case_id}/messages. /conversations queda deprecado internamente.</w:t>
+            </w:r>
+          </w:p>
+        </w:tc>
+      </w:tr>
+      <w:tr>
+        <w:tc>
+          <w:tcPr>
+            <w:tcW w:type="dxa" w:w="5112"/>
+          </w:tcPr>
+          <w:p>
+            <w:r>
+              <w:t>Contexto</w:t>
+            </w:r>
+          </w:p>
+        </w:tc>
+        <w:tc>
+          <w:tcPr>
+            <w:tcW w:type="dxa" w:w="5112"/>
+          </w:tcPr>
+          <w:p>
+            <w:r>
+              <w:t>El prompt se arma con system prompt, resumen tecnico del caso, ultimos mensajes completos, contexto RAG y mensaje actual del usuario.</w:t>
+            </w:r>
+          </w:p>
+        </w:tc>
+      </w:tr>
+      <w:tr>
+        <w:tc>
+          <w:tcPr>
+            <w:tcW w:type="dxa" w:w="5112"/>
+          </w:tcPr>
+          <w:p>
+            <w:r>
+              <w:t>Compactacion</w:t>
+            </w:r>
+          </w:p>
+        </w:tc>
+        <w:tc>
+          <w:tcPr>
+            <w:tcW w:type="dxa" w:w="5112"/>
+          </w:tcPr>
+          <w:p>
+            <w:r>
+              <w:t>Se compacta si hay mas de 30 mensajes no resumidos o mas de 16,000 tokens estimados. Siempre se conservan los ultimos 10 mensajes completos.</w:t>
+            </w:r>
+          </w:p>
+        </w:tc>
+      </w:tr>
+      <w:tr>
+        <w:tc>
+          <w:tcPr>
+            <w:tcW w:type="dxa" w:w="5112"/>
+          </w:tcPr>
+          <w:p>
+            <w:r>
+              <w:t>Fallback</w:t>
+            </w:r>
+          </w:p>
+        </w:tc>
+        <w:tc>
+          <w:tcPr>
+            <w:tcW w:type="dxa" w:w="5112"/>
+          </w:tcPr>
+          <w:p>
+            <w:r>
+              <w:t>Si Claude falla al resumir, el chat no se rompe: usa resumen existente, mensajes recientes y RAG.</w:t>
+            </w:r>
+          </w:p>
+        </w:tc>
+      </w:tr>
+      <w:tr>
+        <w:tc>
+          <w:tcPr>
+            <w:tcW w:type="dxa" w:w="5112"/>
+          </w:tcPr>
+          <w:p>
+            <w:r>
+              <w:t>Cache</w:t>
+            </w:r>
+          </w:p>
+        </w:tc>
+        <w:tc>
+          <w:tcPr>
+            <w:tcW w:type="dxa" w:w="5112"/>
+          </w:tcPr>
+          <w:p>
+            <w:r>
+              <w:t>La cache exacta incluye caso tecnico, fingerprint de resumen/contexto, ultimos mensajes, RAG, version del prompt y huella de knowledge base.</w:t>
+            </w:r>
+          </w:p>
+        </w:tc>
+      </w:tr>
+      <w:tr>
+        <w:tc>
+          <w:tcPr>
+            <w:tcW w:type="dxa" w:w="5112"/>
+          </w:tcPr>
+          <w:p>
+            <w:r>
+              <w:t>Usage</w:t>
+            </w:r>
+          </w:p>
+        </w:tc>
+        <w:tc>
+          <w:tcPr>
+            <w:tcW w:type="dxa" w:w="5112"/>
+          </w:tcPr>
+          <w:p>
+            <w:r>
+              <w:t>La compactacion se registra como context_compaction para entender costos de contexto por separado.</w:t>
+            </w:r>
+          </w:p>
+        </w:tc>
+      </w:tr>
+      <w:tr>
+        <w:tc>
+          <w:tcPr>
+            <w:tcW w:type="dxa" w:w="5112"/>
+          </w:tcPr>
+          <w:p>
+            <w:r>
+              <w:t>Frontend</w:t>
+            </w:r>
+          </w:p>
+        </w:tc>
+        <w:tc>
+          <w:tcPr>
+            <w:tcW w:type="dxa" w:w="5112"/>
+          </w:tcPr>
+          <w:p>
+            <w:r>
+              <w:t>UX recomendada: lista de casos tecnicos, chat activo con streaming y panel editable de metadata del caso.</w:t>
+            </w:r>
+          </w:p>
+        </w:tc>
+      </w:tr>
+      <w:tr>
+        <w:tc>
+          <w:tcPr>
+            <w:tcW w:type="dxa" w:w="5112"/>
+          </w:tcPr>
+          <w:p>
+            <w:r>
+              <w:t>Tests</w:t>
+            </w:r>
+          </w:p>
+        </w:tc>
+        <w:tc>
+          <w:tcPr>
+            <w:tcW w:type="dxa" w:w="5112"/>
+          </w:tcPr>
+          <w:p>
+            <w:r>
+              <w:t>Suite Docker verificada: 51 passed.</w:t>
             </w:r>
           </w:p>
         </w:tc>

</xml_diff>

<commit_message>
feat: implement error code catalog base
</commit_message>
<xml_diff>
--- a/documentation/CoolAgent_Documentacion_Maestra.docx
+++ b/documentation/CoolAgent_Documentacion_Maestra.docx
@@ -513,16 +513,8 @@
             <w:shd w:fill="F4CCCC"/>
           </w:tcPr>
           <w:p>
-            <w:pPr>
-              <w:jc w:val="left"/>
-            </w:pPr>
-            <w:r/>
-            <w:r>
-              <w:rPr>
-                <w:b w:val="0"/>
-                <w:sz w:val="18"/>
-              </w:rPr>
-              <w:t>Placeholder: modelos/schemas existen, router devuelve listas vacias.</w:t>
+            <w:r>
+              <w:t>Base implementada: endpoints reales de busqueda/listado, migracion de soporte y seed de fabricantes prioritarios. Catalogo real de codigos pendiente de cargar desde manuales confiables.</w:t>
             </w:r>
           </w:p>
         </w:tc>
@@ -1165,16 +1157,8 @@
             <w:shd w:fill="F4CCCC"/>
           </w:tcPr>
           <w:p>
-            <w:pPr>
-              <w:jc w:val="left"/>
-            </w:pPr>
-            <w:r/>
-            <w:r>
-              <w:rPr>
-                <w:b w:val="0"/>
-                <w:sz w:val="18"/>
-              </w:rPr>
-              <w:t>Placeholder</w:t>
+            <w:r>
+              <w:t>Base implementada</w:t>
             </w:r>
           </w:p>
         </w:tc>
@@ -1184,16 +1168,8 @@
             <w:vAlign w:val="center"/>
           </w:tcPr>
           <w:p>
-            <w:pPr>
-              <w:jc w:val="left"/>
-            </w:pPr>
-            <w:r/>
-            <w:r>
-              <w:rPr>
-                <w:b w:val="0"/>
-                <w:sz w:val="18"/>
-              </w:rPr>
-              <w:t>Modelos/schemas existen; busqueda y seed de datos pendientes.</w:t>
+            <w:r>
+              <w:t>Busca por codigo, fabricante y modelo; lista fabricantes con conteos reales. Seed local carga 8 fabricantes prioritarios. No se inventan codigos: el catalogo real debe venir de manuales o fuentes trazables.</w:t>
             </w:r>
           </w:p>
         </w:tc>
@@ -2166,16 +2142,8 @@
             <w:shd w:fill="F4CCCC"/>
           </w:tcPr>
           <w:p>
-            <w:pPr>
-              <w:jc w:val="left"/>
-            </w:pPr>
-            <w:r/>
-            <w:r>
-              <w:rPr>
-                <w:b w:val="0"/>
-                <w:sz w:val="18"/>
-              </w:rPr>
-              <w:t>Placeholder</w:t>
+            <w:r>
+              <w:t>Actual: busqueda real por codigo, fabricante y modelo</w:t>
             </w:r>
           </w:p>
         </w:tc>
@@ -2226,16 +2194,8 @@
             <w:shd w:fill="F4CCCC"/>
           </w:tcPr>
           <w:p>
-            <w:pPr>
-              <w:jc w:val="left"/>
-            </w:pPr>
-            <w:r/>
-            <w:r>
-              <w:rPr>
-                <w:b w:val="0"/>
-                <w:sz w:val="18"/>
-              </w:rPr>
-              <w:t>Placeholder</w:t>
+            <w:r>
+              <w:t>Actual: lista fabricantes con conteos reales</w:t>
             </w:r>
           </w:p>
         </w:tc>
@@ -2837,7 +2797,7 @@
           </w:tcPr>
           <w:p>
             <w:r>
-              <w:t>Codigos de error</w:t>
+              <w:t>Fase D base implementada</w:t>
             </w:r>
           </w:p>
         </w:tc>
@@ -2848,7 +2808,7 @@
           </w:tcPr>
           <w:p>
             <w:r>
-              <w:t>Seed inicial por fabricante/modelo y endpoints reales de busqueda.</w:t>
+              <w:t>Endpoints reales y seed de fabricantes prioritarios listos. Pendiente cargar codigos reales desde manuales confiables y relacionarlos con documentos RAG.</w:t>
             </w:r>
           </w:p>
         </w:tc>
@@ -2960,7 +2920,7 @@
             <w:r>
               <w:t>Recomendacion de secuencia</w:t>
               <w:br/>
-              <w:t>Con Fase C2 cerrada, el backend ya tiene un contrato mas estable para chat/RAG: casos tecnicos, metadata opcional, mensajes paginados y streaming. El siguiente paso puede ser Fase D codigos de error o comenzar el frontend MVP consumiendo casos tecnicos. No retomar rate limiting hasta disenar usuarios, planes, costo por usuario y monetizacion.</w:t>
+              <w:t>Con Fase D base implementada, el siguiente paso puede ser cargar un primer lote pequeno de codigos reales desde manuales confiables o iniciar el frontend MVP sobre casos tecnicos, chat/RAG y busqueda de codigos. No retomar rate limiting hasta disenar usuarios, planes, costo por usuario y monetizacion.</w:t>
             </w:r>
           </w:p>
         </w:tc>
@@ -5264,7 +5224,229 @@
           </w:tcPr>
           <w:p>
             <w:r>
-              <w:t>Suite Docker verificada: 51 passed.</w:t>
+              <w:t>Suite Docker verificada: 54 passed.</w:t>
+            </w:r>
+          </w:p>
+        </w:tc>
+      </w:tr>
+    </w:tbl>
+    <w:p>
+      <w:pPr>
+        <w:pStyle w:val="Heading1"/>
+      </w:pPr>
+      <w:r>
+        <w:t>16. Fase D: Codigos de error</w:t>
+      </w:r>
+    </w:p>
+    <w:p>
+      <w:r>
+        <w:t>Fase D convierte el modulo de codigos de error de placeholder a una base consultable. La estructura ya permite buscar por codigo, fabricante y modelo, y listar fabricantes con conteos reales. La decision importante es no inventar codigos: el catalogo tecnico debe crecer desde manuales, boletines o documentos trazables.</w:t>
+      </w:r>
+    </w:p>
+    <w:tbl>
+      <w:tblPr>
+        <w:tblStyle w:val="TableGrid"/>
+        <w:tblW w:type="auto" w:w="0"/>
+        <w:tblLook w:firstColumn="1" w:firstRow="1" w:lastColumn="0" w:lastRow="0" w:noHBand="0" w:noVBand="1" w:val="04A0"/>
+      </w:tblPr>
+      <w:tblGrid>
+        <w:gridCol w:w="5112"/>
+        <w:gridCol w:w="5112"/>
+      </w:tblGrid>
+      <w:tr>
+        <w:tc>
+          <w:tcPr>
+            <w:tcW w:type="dxa" w:w="5112"/>
+          </w:tcPr>
+          <w:p>
+            <w:r>
+              <w:t>Elemento</w:t>
+            </w:r>
+          </w:p>
+        </w:tc>
+        <w:tc>
+          <w:tcPr>
+            <w:tcW w:type="dxa" w:w="5112"/>
+          </w:tcPr>
+          <w:p>
+            <w:r>
+              <w:t>Decision vigente</w:t>
+            </w:r>
+          </w:p>
+        </w:tc>
+      </w:tr>
+      <w:tr>
+        <w:tc>
+          <w:tcPr>
+            <w:tcW w:type="dxa" w:w="5112"/>
+          </w:tcPr>
+          <w:p>
+            <w:r>
+              <w:t>Migracion</w:t>
+            </w:r>
+          </w:p>
+        </w:tc>
+        <w:tc>
+          <w:tcPr>
+            <w:tcW w:type="dxa" w:w="5112"/>
+          </w:tcPr>
+          <w:p>
+            <w:r>
+              <w:t>Alembic 20260501_0006 agrega source, updated_at e indices por fabricante/modelo.</w:t>
+            </w:r>
+          </w:p>
+        </w:tc>
+      </w:tr>
+      <w:tr>
+        <w:tc>
+          <w:tcPr>
+            <w:tcW w:type="dxa" w:w="5112"/>
+          </w:tcPr>
+          <w:p>
+            <w:r>
+              <w:t>Busqueda</w:t>
+            </w:r>
+          </w:p>
+        </w:tc>
+        <w:tc>
+          <w:tcPr>
+            <w:tcW w:type="dxa" w:w="5112"/>
+          </w:tcPr>
+          <w:p>
+            <w:r>
+              <w:t>GET /api/v1/error-codes/ filtra por code, manufacturer y model con limit/offset.</w:t>
+            </w:r>
+          </w:p>
+        </w:tc>
+      </w:tr>
+      <w:tr>
+        <w:tc>
+          <w:tcPr>
+            <w:tcW w:type="dxa" w:w="5112"/>
+          </w:tcPr>
+          <w:p>
+            <w:r>
+              <w:t>Fabricantes</w:t>
+            </w:r>
+          </w:p>
+        </w:tc>
+        <w:tc>
+          <w:tcPr>
+            <w:tcW w:type="dxa" w:w="5112"/>
+          </w:tcPr>
+          <w:p>
+            <w:r>
+              <w:t>GET /api/v1/error-codes/manufacturers devuelve id, nombre, pais, website, model_count y error_code_count.</w:t>
+            </w:r>
+          </w:p>
+        </w:tc>
+      </w:tr>
+      <w:tr>
+        <w:tc>
+          <w:tcPr>
+            <w:tcW w:type="dxa" w:w="5112"/>
+          </w:tcPr>
+          <w:p>
+            <w:r>
+              <w:t>Seed</w:t>
+            </w:r>
+          </w:p>
+        </w:tc>
+        <w:tc>
+          <w:tcPr>
+            <w:tcW w:type="dxa" w:w="5112"/>
+          </w:tcPr>
+          <w:p>
+            <w:r>
+              <w:t>backend/scripts/seed_error_codes.py carga 8 fabricantes prioritarios de forma idempotente.</w:t>
+            </w:r>
+          </w:p>
+        </w:tc>
+      </w:tr>
+      <w:tr>
+        <w:tc>
+          <w:tcPr>
+            <w:tcW w:type="dxa" w:w="5112"/>
+          </w:tcPr>
+          <w:p>
+            <w:r>
+              <w:t>Calidad de datos</w:t>
+            </w:r>
+          </w:p>
+        </w:tc>
+        <w:tc>
+          <w:tcPr>
+            <w:tcW w:type="dxa" w:w="5112"/>
+          </w:tcPr>
+          <w:p>
+            <w:r>
+              <w:t>TRUSTED_ERROR_CODES queda vacio por defecto para no inventar datos tecnicos. Solo se deben agregar codigos con fuente trazable.</w:t>
+            </w:r>
+          </w:p>
+        </w:tc>
+      </w:tr>
+      <w:tr>
+        <w:tc>
+          <w:tcPr>
+            <w:tcW w:type="dxa" w:w="5112"/>
+          </w:tcPr>
+          <w:p>
+            <w:r>
+              <w:t>Validacion local</w:t>
+            </w:r>
+          </w:p>
+        </w:tc>
+        <w:tc>
+          <w:tcPr>
+            <w:tcW w:type="dxa" w:w="5112"/>
+          </w:tcPr>
+          <w:p>
+            <w:r>
+              <w:t>Base local en 20260501_0006; 8 fabricantes cargados; RAG intacto con 1 documento y 1 chunk.</w:t>
+            </w:r>
+          </w:p>
+        </w:tc>
+      </w:tr>
+      <w:tr>
+        <w:tc>
+          <w:tcPr>
+            <w:tcW w:type="dxa" w:w="5112"/>
+          </w:tcPr>
+          <w:p>
+            <w:r>
+              <w:t>Tests</w:t>
+            </w:r>
+          </w:p>
+        </w:tc>
+        <w:tc>
+          <w:tcPr>
+            <w:tcW w:type="dxa" w:w="5112"/>
+          </w:tcPr>
+          <w:p>
+            <w:r>
+              <w:t>Suite Docker verificada: 54 passed.</w:t>
+            </w:r>
+          </w:p>
+        </w:tc>
+      </w:tr>
+      <w:tr>
+        <w:tc>
+          <w:tcPr>
+            <w:tcW w:type="dxa" w:w="5112"/>
+          </w:tcPr>
+          <w:p>
+            <w:r>
+              <w:t>Pendiente</w:t>
+            </w:r>
+          </w:p>
+        </w:tc>
+        <w:tc>
+          <w:tcPr>
+            <w:tcW w:type="dxa" w:w="5112"/>
+          </w:tcPr>
+          <w:p>
+            <w:r>
+              <w:t>Cargar codigos reales por fabricante/modelo desde manuales confiables y relacionarlos con documentos RAG cuando aplique.</w:t>
             </w:r>
           </w:p>
         </w:tc>

</xml_diff>

<commit_message>
feat: derive error codes from knowledge
</commit_message>
<xml_diff>
--- a/documentation/CoolAgent_Documentacion_Maestra.docx
+++ b/documentation/CoolAgent_Documentacion_Maestra.docx
@@ -80,7 +80,7 @@
           </w:tcPr>
           <w:p>
             <w:r>
-              <w:t>1 de mayo de 2026</w:t>
+              <w:t>2 de mayo de 2026</w:t>
             </w:r>
           </w:p>
         </w:tc>
@@ -333,7 +333,7 @@
           </w:tcPr>
           <w:p>
             <w:r>
-              <w:t>Estado actual al 01/05/2026</w:t>
+              <w:t>Estado actual al 02/05/2026</w:t>
             </w:r>
           </w:p>
         </w:tc>
@@ -514,7 +514,7 @@
           </w:tcPr>
           <w:p>
             <w:r>
-              <w:t>Base implementada: endpoints reales de busqueda/listado, migracion de soporte y seed de fabricantes prioritarios. Catalogo real de codigos pendiente de cargar desde manuales confiables.</w:t>
+              <w:t>Implementado como indice estructurado derivado de Knowledge: busqueda/listado, extraccion desde documentos RAG, trazabilidad a documento/chunk y revision antes de publicar.</w:t>
             </w:r>
           </w:p>
         </w:tc>
@@ -546,16 +546,8 @@
             <w:shd w:fill="F4CCCC"/>
           </w:tcPr>
           <w:p>
-            <w:pPr>
-              <w:jc w:val="left"/>
-            </w:pPr>
-            <w:r/>
-            <w:r>
-              <w:rPr>
-                <w:b w:val="0"/>
-                <w:sz w:val="18"/>
-              </w:rPr>
-              <w:t>Vacio: solo .gitkeep.</w:t>
+            <w:r>
+              <w:t>MVP mobile iniciado en frontend/: Expo/React Native con navegacion, mock data, casos/chat y codigos conectados a API con fallback.</w:t>
             </w:r>
           </w:p>
         </w:tc>
@@ -1158,7 +1150,7 @@
           </w:tcPr>
           <w:p>
             <w:r>
-              <w:t>Base implementada</w:t>
+              <w:t>Implementado derivado de Knowledge</w:t>
             </w:r>
           </w:p>
         </w:tc>
@@ -1169,7 +1161,7 @@
           </w:tcPr>
           <w:p>
             <w:r>
-              <w:t>Busca por codigo, fabricante y modelo; lista fabricantes con conteos reales. Seed local carga 8 fabricantes prioritarios. No se inventan codigos: el catalogo real debe venir de manuales o fuentes trazables.</w:t>
+              <w:t>Busca por codigo, fabricante y modelo; extrae candidatos desde documentos RAG y solo muestra codigos aprobados por defecto. Cada codigo conserva fuente, documento, chunk, excerpt y estado de revision.</w:t>
             </w:r>
           </w:p>
         </w:tc>
@@ -1201,16 +1193,8 @@
             <w:shd w:fill="F4CCCC"/>
           </w:tcPr>
           <w:p>
-            <w:pPr>
-              <w:jc w:val="left"/>
-            </w:pPr>
-            <w:r/>
-            <w:r>
-              <w:rPr>
-                <w:b w:val="0"/>
-                <w:sz w:val="18"/>
-              </w:rPr>
-              <w:t>Vacio</w:t>
+            <w:r>
+              <w:t>MVP scaffold implementado</w:t>
             </w:r>
           </w:p>
         </w:tc>
@@ -1221,7 +1205,7 @@
           </w:tcPr>
           <w:p>
             <w:r>
-              <w:t>No usar un chat central infinito. El frontend recomendado es lista de casos tecnicos + chat activo + panel editable de metadata.</w:t>
+              <w:t>App Expo/React Native en frontend/. Navegacion mobile, screens con mock data y adapters para API. No incluye upload RAG desde mobile.</w:t>
             </w:r>
           </w:p>
         </w:tc>
@@ -2548,6 +2532,102 @@
           </w:p>
         </w:tc>
       </w:tr>
+      <w:tr>
+        <w:tc>
+          <w:tcPr>
+            <w:tcW w:type="dxa" w:w="3408"/>
+          </w:tcPr>
+          <w:p>
+            <w:r>
+              <w:t>Knowledge</w:t>
+            </w:r>
+          </w:p>
+        </w:tc>
+        <w:tc>
+          <w:tcPr>
+            <w:tcW w:type="dxa" w:w="3408"/>
+          </w:tcPr>
+          <w:p>
+            <w:r>
+              <w:t>GET /api/v1/knowledge/glossary</w:t>
+            </w:r>
+          </w:p>
+        </w:tc>
+        <w:tc>
+          <w:tcPr>
+            <w:tcW w:type="dxa" w:w="3408"/>
+          </w:tcPr>
+          <w:p>
+            <w:r>
+              <w:t>Actual: glosario de documentos RAG sin exponer chunks completos</w:t>
+            </w:r>
+          </w:p>
+        </w:tc>
+      </w:tr>
+      <w:tr>
+        <w:tc>
+          <w:tcPr>
+            <w:tcW w:type="dxa" w:w="3408"/>
+          </w:tcPr>
+          <w:p>
+            <w:r>
+              <w:t>Error Codes</w:t>
+            </w:r>
+          </w:p>
+        </w:tc>
+        <w:tc>
+          <w:tcPr>
+            <w:tcW w:type="dxa" w:w="3408"/>
+          </w:tcPr>
+          <w:p>
+            <w:r>
+              <w:t>POST /api/v1/error-codes/extract/from-document/{document_id}</w:t>
+            </w:r>
+          </w:p>
+        </w:tc>
+        <w:tc>
+          <w:tcPr>
+            <w:tcW w:type="dxa" w:w="3408"/>
+          </w:tcPr>
+          <w:p>
+            <w:r>
+              <w:t>Actual: extrae candidatos desde un documento Knowledge y los deja pendientes por defecto</w:t>
+            </w:r>
+          </w:p>
+        </w:tc>
+      </w:tr>
+      <w:tr>
+        <w:tc>
+          <w:tcPr>
+            <w:tcW w:type="dxa" w:w="3408"/>
+          </w:tcPr>
+          <w:p>
+            <w:r>
+              <w:t>Error Codes</w:t>
+            </w:r>
+          </w:p>
+        </w:tc>
+        <w:tc>
+          <w:tcPr>
+            <w:tcW w:type="dxa" w:w="3408"/>
+          </w:tcPr>
+          <w:p>
+            <w:r>
+              <w:t>PATCH /api/v1/error-codes/{error_code_id}/review</w:t>
+            </w:r>
+          </w:p>
+        </w:tc>
+        <w:tc>
+          <w:tcPr>
+            <w:tcW w:type="dxa" w:w="3408"/>
+          </w:tcPr>
+          <w:p>
+            <w:r>
+              <w:t>Actual: aprueba, rechaza o devuelve un codigo a revision</w:t>
+            </w:r>
+          </w:p>
+        </w:tc>
+      </w:tr>
     </w:tbl>
     <w:p/>
     <w:p>
@@ -2797,7 +2877,7 @@
           </w:tcPr>
           <w:p>
             <w:r>
-              <w:t>Fase D base implementada</w:t>
+              <w:t>Fase D implementada</w:t>
             </w:r>
           </w:p>
         </w:tc>
@@ -2808,7 +2888,7 @@
           </w:tcPr>
           <w:p>
             <w:r>
-              <w:t>Endpoints reales y seed de fabricantes prioritarios listos. Pendiente cargar codigos reales desde manuales confiables y relacionarlos con documentos RAG.</w:t>
+              <w:t>Codigos de error quedan como indice derivado de Knowledge: extraccion desde documentos RAG, revision humana, trazabilidad a fuente y busqueda mobile solo de aprobados.</w:t>
             </w:r>
           </w:p>
         </w:tc>
@@ -2840,7 +2920,7 @@
           </w:tcPr>
           <w:p>
             <w:r>
-              <w:t>Iniciar cuando el backend tenga contratos de API estables para chat, RAG, usage y errores.</w:t>
+              <w:t>Continuar wiring incremental del MVP mobile y crear endpoints nuevos solo cuando una pantalla real los necesite.</w:t>
             </w:r>
           </w:p>
         </w:tc>
@@ -2860,7 +2940,7 @@
     </w:p>
     <w:p>
       <w:r>
-        <w:t>Con Fase A, B0, C y C2 cerradas, el siguiente paso recomendado es decidir entre fortalecer codigos de error (Fase D) o iniciar el frontend MVP sobre el contrato oficial de casos tecnicos.</w:t>
+        <w:t>Con Fase A, B0, B, C, C2 y Fase D base cerradas, el siguiente paso recomendado es usar el flujo provisional por Swagger para alimentar codigos desde documentos reales y continuar el frontend MVP con wiring incremental.</w:t>
       </w:r>
     </w:p>
     <w:p>
@@ -2878,7 +2958,7 @@
         <w:spacing w:after="40"/>
       </w:pPr>
       <w:r>
-        <w:t>Si se prioriza Fase D, crear seed inicial de codigos por fabricante/modelo y endpoints reales de busqueda.</w:t>
+        <w:t>Para Fase D, subir manuales a Knowledge, extraer candidatos, revisar/aprobar y publicar solo codigos confiables.</w:t>
       </w:r>
     </w:p>
     <w:p>
@@ -2918,9 +2998,7 @@
           </w:tcPr>
           <w:p>
             <w:r>
-              <w:t>Recomendacion de secuencia</w:t>
-              <w:br/>
-              <w:t>Con Fase D base implementada, el siguiente paso puede ser cargar un primer lote pequeno de codigos reales desde manuales confiables o iniciar el frontend MVP sobre casos tecnicos, chat/RAG y busqueda de codigos. No retomar rate limiting hasta disenar usuarios, planes, costo por usuario y monetizacion.</w:t>
+              <w:t>Recomendacion de secuencia | Con Fase D implementada, el siguiente paso es usar Swagger como flujo provisional: subir manuales a Knowledge, ejecutar extraccion de codigos, revisar/aprobar candidatos y luego validar que la app mobile solo muestre codigos aprobados. El siguiente desarrollo grande puede seguir con wiring incremental del frontend mobile.</w:t>
             </w:r>
           </w:p>
         </w:tc>
@@ -5240,7 +5318,7 @@
     </w:p>
     <w:p>
       <w:r>
-        <w:t>Fase D convierte el modulo de codigos de error de placeholder a una base consultable. La estructura ya permite buscar por codigo, fabricante y modelo, y listar fabricantes con conteos reales. La decision importante es no inventar codigos: el catalogo tecnico debe crecer desde manuales, boletines o documentos trazables.</w:t>
+        <w:t>Fase D mantiene Knowledge como fuente de verdad. Los manuales, boletines y documentos cargados al RAG viven en knowledge_documents/knowledge_chunks; error_codes es un indice estructurado derivado de esos documentos para busqueda rapida, filtros por fabricante/modelo y modo offline futuro. Los codigos extraidos quedan pendientes de revision hasta que una persona los apruebe.</w:t>
       </w:r>
     </w:p>
     <w:tbl>
@@ -5292,7 +5370,7 @@
           </w:tcPr>
           <w:p>
             <w:r>
-              <w:t>Alembic 20260501_0006 agrega source, updated_at e indices por fabricante/modelo.</w:t>
+              <w:t>Alembic 20260501_0006 agrega source/updated_at e indices. Alembic 20260502_0007 agrega trazabilidad a Knowledge y estado de revision.</w:t>
             </w:r>
           </w:p>
         </w:tc>
@@ -5314,7 +5392,7 @@
           </w:tcPr>
           <w:p>
             <w:r>
-              <w:t>GET /api/v1/error-codes/ filtra por code, manufacturer y model con limit/offset.</w:t>
+              <w:t>GET /api/v1/error-codes/ filtra por query, code, manufacturer, model y review_status. Por defecto muestra solo approved.</w:t>
             </w:r>
           </w:p>
         </w:tc>
@@ -5336,7 +5414,7 @@
           </w:tcPr>
           <w:p>
             <w:r>
-              <w:t>GET /api/v1/error-codes/manufacturers devuelve id, nombre, pais, website, model_count y error_code_count.</w:t>
+              <w:t>GET /api/v1/error-codes/manufacturers devuelve conteos filtrables por review_status; por defecto cuenta solo approved.</w:t>
             </w:r>
           </w:p>
         </w:tc>
@@ -5380,7 +5458,7 @@
           </w:tcPr>
           <w:p>
             <w:r>
-              <w:t>TRUSTED_ERROR_CODES queda vacio por defecto para no inventar datos tecnicos. Solo se deben agregar codigos con fuente trazable.</w:t>
+              <w:t>TRUSTED_ERROR_CODES queda vacio por defecto para no inventar datos tecnicos. Los codigos derivados de documentos entran como pending_review.</w:t>
             </w:r>
           </w:p>
         </w:tc>
@@ -5402,7 +5480,7 @@
           </w:tcPr>
           <w:p>
             <w:r>
-              <w:t>Base local en 20260501_0006; 8 fabricantes cargados; RAG intacto con 1 documento y 1 chunk.</w:t>
+              <w:t>Base local actualizada a 20260502_0007 con RAG intacto. La migracion fue aplicada con alembic upgrade head.</w:t>
             </w:r>
           </w:p>
         </w:tc>
@@ -5424,7 +5502,7 @@
           </w:tcPr>
           <w:p>
             <w:r>
-              <w:t>Suite Docker verificada: 54 passed.</w:t>
+              <w:t>Suite Docker verificada: 57 passed.</w:t>
             </w:r>
           </w:p>
         </w:tc>
@@ -5446,7 +5524,51 @@
           </w:tcPr>
           <w:p>
             <w:r>
-              <w:t>Cargar codigos reales por fabricante/modelo desde manuales confiables y relacionarlos con documentos RAG cuando aplique.</w:t>
+              <w:t>Usar Swagger como flujo provisional para extraer/aprobar codigos; mejorar extractor con LLM/parser por fabricante si los manuales reales lo requieren; definir sync offline mobile.</w:t>
+            </w:r>
+          </w:p>
+        </w:tc>
+      </w:tr>
+      <w:tr>
+        <w:tc>
+          <w:tcPr>
+            <w:tcW w:type="dxa" w:w="5112"/>
+          </w:tcPr>
+          <w:p>
+            <w:r>
+              <w:t>Extraccion</w:t>
+            </w:r>
+          </w:p>
+        </w:tc>
+        <w:tc>
+          <w:tcPr>
+            <w:tcW w:type="dxa" w:w="5112"/>
+          </w:tcPr>
+          <w:p>
+            <w:r>
+              <w:t>POST /api/v1/error-codes/extract/from-document/{document_id} crea candidatos desde Knowledge con source_document_id, source_chunk_id, source_excerpt, confidence y extraction_metadata.</w:t>
+            </w:r>
+          </w:p>
+        </w:tc>
+      </w:tr>
+      <w:tr>
+        <w:tc>
+          <w:tcPr>
+            <w:tcW w:type="dxa" w:w="5112"/>
+          </w:tcPr>
+          <w:p>
+            <w:r>
+              <w:t>Revision</w:t>
+            </w:r>
+          </w:p>
+        </w:tc>
+        <w:tc>
+          <w:tcPr>
+            <w:tcW w:type="dxa" w:w="5112"/>
+          </w:tcPr>
+          <w:p>
+            <w:r>
+              <w:t>PATCH /api/v1/error-codes/{error_code_id}/review permite approved, pending_review o rejected. La UX mobile debe consumir approved por defecto.</w:t>
             </w:r>
           </w:p>
         </w:tc>

</xml_diff>

<commit_message>
feat: edit reviewed error code candidates
</commit_message>
<xml_diff>
--- a/documentation/CoolAgent_Documentacion_Maestra.docx
+++ b/documentation/CoolAgent_Documentacion_Maestra.docx
@@ -2628,6 +2628,38 @@
           </w:p>
         </w:tc>
       </w:tr>
+      <w:tr>
+        <w:tc>
+          <w:tcPr>
+            <w:tcW w:type="dxa" w:w="3408"/>
+          </w:tcPr>
+          <w:p>
+            <w:r>
+              <w:t>Error Codes</w:t>
+            </w:r>
+          </w:p>
+        </w:tc>
+        <w:tc>
+          <w:tcPr>
+            <w:tcW w:type="dxa" w:w="3408"/>
+          </w:tcPr>
+          <w:p>
+            <w:r>
+              <w:t>PATCH /api/v1/error-codes/{error_code_id}</w:t>
+            </w:r>
+          </w:p>
+        </w:tc>
+        <w:tc>
+          <w:tcPr>
+            <w:tcW w:type="dxa" w:w="3408"/>
+          </w:tcPr>
+          <w:p>
+            <w:r>
+              <w:t>Actual: corrige candidatos antes de aprobarlos para la busqueda del tecnico</w:t>
+            </w:r>
+          </w:p>
+        </w:tc>
+      </w:tr>
     </w:tbl>
     <w:p/>
     <w:p>
@@ -2888,7 +2920,7 @@
           </w:tcPr>
           <w:p>
             <w:r>
-              <w:t>Codigos de error quedan como indice derivado de Knowledge: extraccion desde documentos RAG, revision humana, trazabilidad a fuente y busqueda mobile solo de aprobados.</w:t>
+              <w:t>Codigos de error quedan como indice derivado de Knowledge: extraccion desde documentos RAG, correccion manual, revision humana, trazabilidad a fuente y busqueda mobile solo de aprobados.</w:t>
             </w:r>
           </w:p>
         </w:tc>
@@ -2958,7 +2990,7 @@
         <w:spacing w:after="40"/>
       </w:pPr>
       <w:r>
-        <w:t>Para Fase D, subir manuales a Knowledge, extraer candidatos, revisar/aprobar y publicar solo codigos confiables.</w:t>
+        <w:t>Para Fase D, subir manuales a Knowledge, extraer candidatos, corregir datos tecnicos si hace falta, revisar/aprobar y publicar solo codigos confiables.</w:t>
       </w:r>
     </w:p>
     <w:p>
@@ -2998,7 +3030,7 @@
           </w:tcPr>
           <w:p>
             <w:r>
-              <w:t>Recomendacion de secuencia | Con Fase D implementada, el siguiente paso es usar Swagger como flujo provisional: subir manuales a Knowledge, ejecutar extraccion de codigos, revisar/aprobar candidatos y luego validar que la app mobile solo muestre codigos aprobados. El siguiente desarrollo grande puede seguir con wiring incremental del frontend mobile.</w:t>
+              <w:t>Recomendacion de secuencia | Mientras se consiguen manuales reales, el flujo provisional queda listo en Swagger: subir manual a Knowledge, extraer candidatos, corregir descripcion/causas/solucion si hace falta, aprobar y validar que la app mobile solo consuma codigos aprobados. Despues se puede mejorar el extractor con Claude para tablas complejas.</w:t>
             </w:r>
           </w:p>
         </w:tc>
@@ -5318,7 +5350,7 @@
     </w:p>
     <w:p>
       <w:r>
-        <w:t>Fase D mantiene Knowledge como fuente de verdad. Los manuales, boletines y documentos cargados al RAG viven en knowledge_documents/knowledge_chunks; error_codes es un indice estructurado derivado de esos documentos para busqueda rapida, filtros por fabricante/modelo y modo offline futuro. Los codigos extraidos quedan pendientes de revision hasta que una persona los apruebe.</w:t>
+        <w:t>Fase D mantiene Knowledge como fuente de verdad. Los manuales, boletines y documentos cargados al RAG viven en knowledge_documents/knowledge_chunks; error_codes es un indice estructurado derivado de esos documentos para busqueda rapida, filtros por fabricante/modelo y modo offline futuro. Los codigos extraidos quedan pendientes de revision y pueden corregirse antes de aprobarse para proteger al tecnico de datos incompletos o mal extraidos.</w:t>
       </w:r>
     </w:p>
     <w:tbl>
@@ -5502,7 +5534,7 @@
           </w:tcPr>
           <w:p>
             <w:r>
-              <w:t>Suite Docker verificada: 57 passed.</w:t>
+              <w:t>Suite Docker verificada: 59 passed.</w:t>
             </w:r>
           </w:p>
         </w:tc>
@@ -5524,7 +5556,7 @@
           </w:tcPr>
           <w:p>
             <w:r>
-              <w:t>Usar Swagger como flujo provisional para extraer/aprobar codigos; mejorar extractor con LLM/parser por fabricante si los manuales reales lo requieren; definir sync offline mobile.</w:t>
+              <w:t>Usar Swagger como flujo provisional para extraer/corregir/aprobar codigos; mejorar extractor con LLM/parser por fabricante si los manuales reales lo requieren; definir sync offline mobile.</w:t>
             </w:r>
           </w:p>
         </w:tc>
@@ -5569,6 +5601,28 @@
           <w:p>
             <w:r>
               <w:t>PATCH /api/v1/error-codes/{error_code_id}/review permite approved, pending_review o rejected. La UX mobile debe consumir approved por defecto.</w:t>
+            </w:r>
+          </w:p>
+        </w:tc>
+      </w:tr>
+      <w:tr>
+        <w:tc>
+          <w:tcPr>
+            <w:tcW w:type="dxa" w:w="5112"/>
+          </w:tcPr>
+          <w:p>
+            <w:r>
+              <w:t>Correccion</w:t>
+            </w:r>
+          </w:p>
+        </w:tc>
+        <w:tc>
+          <w:tcPr>
+            <w:tcW w:type="dxa" w:w="5112"/>
+          </w:tcPr>
+          <w:p>
+            <w:r>
+              <w:t>PATCH /api/v1/error-codes/{error_code_id} permite corregir candidatos antes de aprobarlos: codigo, descripcion, modelo, severidad, causas, solucion, fuente, pagina y excerpt.</w:t>
             </w:r>
           </w:p>
         </w:tc>

</xml_diff>

<commit_message>
docs: note pending real manual validation
</commit_message>
<xml_diff>
--- a/documentation/CoolAgent_Documentacion_Maestra.docx
+++ b/documentation/CoolAgent_Documentacion_Maestra.docx
@@ -80,7 +80,7 @@
           </w:tcPr>
           <w:p>
             <w:r>
-              <w:t>2 de mayo de 2026</w:t>
+              <w:t>3 de mayo de 2026</w:t>
             </w:r>
           </w:p>
         </w:tc>
@@ -333,7 +333,7 @@
           </w:tcPr>
           <w:p>
             <w:r>
-              <w:t>Estado actual al 02/05/2026</w:t>
+              <w:t>Estado actual al 03/05/2026</w:t>
             </w:r>
           </w:p>
         </w:tc>
@@ -514,7 +514,7 @@
           </w:tcPr>
           <w:p>
             <w:r>
-              <w:t>Implementado como indice estructurado derivado de Knowledge: busqueda/listado, extraccion desde documentos RAG, trazabilidad a documento/chunk y revision antes de publicar.</w:t>
+              <w:t>Implementado como indice estructurado derivado de Knowledge: busqueda/listado, extraccion desde documentos RAG, trazabilidad a documento/chunk y revision antes de publicar. Pendiente: validar extractor con un manual real de codigos de error cuando el documento este disponible.</w:t>
             </w:r>
           </w:p>
         </w:tc>
@@ -2990,7 +2990,7 @@
         <w:spacing w:after="40"/>
       </w:pPr>
       <w:r>
-        <w:t>Para Fase D, subir manuales a Knowledge, extraer candidatos, corregir datos tecnicos si hace falta, revisar/aprobar y publicar solo codigos confiables.</w:t>
+        <w:t>Para Fase D, cuando este disponible el manual real, subirlo a Knowledge, extraer candidatos, corregir datos tecnicos si hace falta, comparar contra el documento fuente, revisar/aprobar y publicar solo codigos confiables.</w:t>
       </w:r>
     </w:p>
     <w:p>
@@ -3030,7 +3030,7 @@
           </w:tcPr>
           <w:p>
             <w:r>
-              <w:t>Recomendacion de secuencia | Mientras se consiguen manuales reales, el flujo provisional queda listo en Swagger: subir manual a Knowledge, extraer candidatos, corregir descripcion/causas/solucion si hace falta, aprobar y validar que la app mobile solo consuma codigos aprobados. Despues se puede mejorar el extractor con Claude para tablas complejas.</w:t>
+              <w:t>Recomendacion de secuencia | El flujo provisional de codigos queda listo en Swagger, pero sigue pendiente la prueba con manual real: subir manual a Knowledge, extraer candidatos, corregir descripcion/causas/solucion si hace falta, aprobar y validar que la app mobile solo consuma codigos aprobados. Si el manual trae tablas complejas, evaluar una segunda pasada con Claude o parser especifico por fabricante.</w:t>
             </w:r>
           </w:p>
         </w:tc>
@@ -5350,7 +5350,7 @@
     </w:p>
     <w:p>
       <w:r>
-        <w:t>Fase D mantiene Knowledge como fuente de verdad. Los manuales, boletines y documentos cargados al RAG viven en knowledge_documents/knowledge_chunks; error_codes es un indice estructurado derivado de esos documentos para busqueda rapida, filtros por fabricante/modelo y modo offline futuro. Los codigos extraidos quedan pendientes de revision y pueden corregirse antes de aprobarse para proteger al tecnico de datos incompletos o mal extraidos.</w:t>
+        <w:t>Fase D mantiene Knowledge como fuente de verdad. Los manuales, boletines y documentos cargados al RAG viven en knowledge_documents/knowledge_chunks; error_codes es un indice estructurado derivado de esos documentos para busqueda rapida, filtros por fabricante/modelo y modo offline futuro. Los codigos extraidos quedan pendientes de revision y pueden corregirse antes de aprobarse. Validacion pendiente: probar el flujo con un manual real de codigos de error cuando el documento sea entregado en los proximos dias.</w:t>
       </w:r>
     </w:p>
     <w:tbl>
@@ -5556,7 +5556,7 @@
           </w:tcPr>
           <w:p>
             <w:r>
-              <w:t>Usar Swagger como flujo provisional para extraer/corregir/aprobar codigos; mejorar extractor con LLM/parser por fabricante si los manuales reales lo requieren; definir sync offline mobile.</w:t>
+              <w:t>Probar con manual real de codigos de error cuando este disponible; comparar candidatos contra la fuente; usar Swagger como flujo provisional para extraer/corregir/aprobar; mejorar extractor con LLM/parser si los manuales reales lo requieren; definir sync offline mobile.</w:t>
             </w:r>
           </w:p>
         </w:tc>
@@ -5623,6 +5623,28 @@
           <w:p>
             <w:r>
               <w:t>PATCH /api/v1/error-codes/{error_code_id} permite corregir candidatos antes de aprobarlos: codigo, descripcion, modelo, severidad, causas, solucion, fuente, pagina y excerpt.</w:t>
+            </w:r>
+          </w:p>
+        </w:tc>
+      </w:tr>
+      <w:tr>
+        <w:tc>
+          <w:tcPr>
+            <w:tcW w:type="dxa" w:w="5112"/>
+          </w:tcPr>
+          <w:p>
+            <w:r>
+              <w:t>Validacion pendiente</w:t>
+            </w:r>
+          </w:p>
+        </w:tc>
+        <w:tc>
+          <w:tcPr>
+            <w:tcW w:type="dxa" w:w="5112"/>
+          </w:tcPr>
+          <w:p>
+            <w:r>
+              <w:t>El extractor paso tests automaticos, pero aun no se ha probado con un manual real de fabricante. No tratar el extractor simple como definitivo hasta validar codigos, paginas, excerpts y falsos positivos.</w:t>
             </w:r>
           </w:p>
         </w:tc>

</xml_diff>

<commit_message>
feat: add user registration auth
</commit_message>
<xml_diff>
--- a/documentation/CoolAgent_Documentacion_Maestra.docx
+++ b/documentation/CoolAgent_Documentacion_Maestra.docx
@@ -580,7 +580,7 @@
           </w:tcPr>
           <w:p>
             <w:r>
-              <w:t>Pendiente: aparecen en requerimientos, no estan implementados. Rate limiting se pospone hasta definir usuarios, planes y monetizacion.</w:t>
+              <w:t>Base implementada: registro, login, JWT bearer y /me. Pendiente: proteger endpoints existentes, asociar recursos a user_id, verificacion de email, recuperacion de password, roles/admin y monetizacion.</w:t>
             </w:r>
           </w:p>
         </w:tc>
@@ -1297,16 +1297,8 @@
             <w:shd w:fill="FFF2CC"/>
           </w:tcPr>
           <w:p>
-            <w:pPr>
-              <w:jc w:val="left"/>
-            </w:pPr>
-            <w:r/>
-            <w:r>
-              <w:rPr>
-                <w:b w:val="0"/>
-                <w:sz w:val="18"/>
-              </w:rPr>
-              <w:t>Pendiente</w:t>
+            <w:r>
+              <w:t>Base implementada</w:t>
             </w:r>
           </w:p>
         </w:tc>
@@ -1316,16 +1308,8 @@
             <w:vAlign w:val="center"/>
           </w:tcPr>
           <w:p>
-            <w:pPr>
-              <w:jc w:val="left"/>
-            </w:pPr>
-            <w:r/>
-            <w:r>
-              <w:rPr>
-                <w:b w:val="0"/>
-                <w:sz w:val="18"/>
-              </w:rPr>
-              <w:t>Requerido antes de uso real multiusuario.</w:t>
+            <w:r>
+              <w:t>Registro/login con JWT listo en backend. Aun no se fuerza autenticacion en chat/RAG/codigos para no romper desarrollo local; ownership y roles quedan pendientes.</w:t>
             </w:r>
           </w:p>
         </w:tc>
@@ -2660,6 +2644,102 @@
           </w:p>
         </w:tc>
       </w:tr>
+      <w:tr>
+        <w:tc>
+          <w:tcPr>
+            <w:tcW w:type="dxa" w:w="3408"/>
+          </w:tcPr>
+          <w:p>
+            <w:r>
+              <w:t>Auth</w:t>
+            </w:r>
+          </w:p>
+        </w:tc>
+        <w:tc>
+          <w:tcPr>
+            <w:tcW w:type="dxa" w:w="3408"/>
+          </w:tcPr>
+          <w:p>
+            <w:r>
+              <w:t>POST /api/v1/auth/register</w:t>
+            </w:r>
+          </w:p>
+        </w:tc>
+        <w:tc>
+          <w:tcPr>
+            <w:tcW w:type="dxa" w:w="3408"/>
+          </w:tcPr>
+          <w:p>
+            <w:r>
+              <w:t>Actual: crea usuario local con email/password</w:t>
+            </w:r>
+          </w:p>
+        </w:tc>
+      </w:tr>
+      <w:tr>
+        <w:tc>
+          <w:tcPr>
+            <w:tcW w:type="dxa" w:w="3408"/>
+          </w:tcPr>
+          <w:p>
+            <w:r>
+              <w:t>Auth</w:t>
+            </w:r>
+          </w:p>
+        </w:tc>
+        <w:tc>
+          <w:tcPr>
+            <w:tcW w:type="dxa" w:w="3408"/>
+          </w:tcPr>
+          <w:p>
+            <w:r>
+              <w:t>POST /api/v1/auth/login</w:t>
+            </w:r>
+          </w:p>
+        </w:tc>
+        <w:tc>
+          <w:tcPr>
+            <w:tcW w:type="dxa" w:w="3408"/>
+          </w:tcPr>
+          <w:p>
+            <w:r>
+              <w:t>Actual: devuelve JWT bearer y perfil del usuario</w:t>
+            </w:r>
+          </w:p>
+        </w:tc>
+      </w:tr>
+      <w:tr>
+        <w:tc>
+          <w:tcPr>
+            <w:tcW w:type="dxa" w:w="3408"/>
+          </w:tcPr>
+          <w:p>
+            <w:r>
+              <w:t>Auth</w:t>
+            </w:r>
+          </w:p>
+        </w:tc>
+        <w:tc>
+          <w:tcPr>
+            <w:tcW w:type="dxa" w:w="3408"/>
+          </w:tcPr>
+          <w:p>
+            <w:r>
+              <w:t>GET /api/v1/auth/me</w:t>
+            </w:r>
+          </w:p>
+        </w:tc>
+        <w:tc>
+          <w:tcPr>
+            <w:tcW w:type="dxa" w:w="3408"/>
+          </w:tcPr>
+          <w:p>
+            <w:r>
+              <w:t>Actual: devuelve perfil usando token bearer</w:t>
+            </w:r>
+          </w:p>
+        </w:tc>
+      </w:tr>
     </w:tbl>
     <w:p/>
     <w:p>
@@ -2953,6 +3033,38 @@
           <w:p>
             <w:r>
               <w:t>Continuar wiring incremental del MVP mobile y crear endpoints nuevos solo cuando una pantalla real los necesite.</w:t>
+            </w:r>
+          </w:p>
+        </w:tc>
+      </w:tr>
+      <w:tr>
+        <w:tc>
+          <w:tcPr>
+            <w:tcW w:type="dxa" w:w="3408"/>
+          </w:tcPr>
+          <w:p>
+            <w:r>
+              <w:t>7</w:t>
+            </w:r>
+          </w:p>
+        </w:tc>
+        <w:tc>
+          <w:tcPr>
+            <w:tcW w:type="dxa" w:w="3408"/>
+          </w:tcPr>
+          <w:p>
+            <w:r>
+              <w:t>Fase E0 base implementada</w:t>
+            </w:r>
+          </w:p>
+        </w:tc>
+        <w:tc>
+          <w:tcPr>
+            <w:tcW w:type="dxa" w:w="3408"/>
+          </w:tcPr>
+          <w:p>
+            <w:r>
+              <w:t>Auth backend listo: registro, login, JWT y /me. Pendiente ownership de datos, roles, password reset y verificacion de email.</w:t>
             </w:r>
           </w:p>
         </w:tc>
@@ -3030,7 +3142,7 @@
           </w:tcPr>
           <w:p>
             <w:r>
-              <w:t>Recomendacion de secuencia | El flujo provisional de codigos queda listo en Swagger, pero sigue pendiente la prueba con manual real: subir manual a Knowledge, extraer candidatos, corregir descripcion/causas/solucion si hace falta, aprobar y validar que la app mobile solo consuma codigos aprobados. Si el manual trae tablas complejas, evaluar una segunda pasada con Claude o parser especifico por fabricante.</w:t>
+              <w:t>Recomendacion de secuencia | La integracion completa de codigos queda pendiente hasta probar un manual real. Mientras tanto, avanzar con auth mobile: pantallas de registro/login, almacenamiento seguro del token y luego asociar casos tecnicos al usuario autenticado.</w:t>
             </w:r>
           </w:p>
         </w:tc>
@@ -5645,6 +5757,206 @@
           <w:p>
             <w:r>
               <w:t>El extractor paso tests automaticos, pero aun no se ha probado con un manual real de fabricante. No tratar el extractor simple como definitivo hasta validar codigos, paginas, excerpts y falsos positivos.</w:t>
+            </w:r>
+          </w:p>
+        </w:tc>
+      </w:tr>
+    </w:tbl>
+    <w:p>
+      <w:pPr>
+        <w:pStyle w:val="Heading1"/>
+      </w:pPr>
+      <w:r>
+        <w:t>17. Fase E0: Auth y registro de usuarios</w:t>
+      </w:r>
+    </w:p>
+    <w:p>
+      <w:r>
+        <w:t>Se implemento una base de autenticacion backend para preparar CoolAgent para cuentas reales sin bloquear todavia el desarrollo local. La app ya puede registrar usuarios, iniciar sesion y consultar el perfil autenticado con JWT bearer.</w:t>
+      </w:r>
+    </w:p>
+    <w:tbl>
+      <w:tblPr>
+        <w:tblStyle w:val="TableGrid"/>
+        <w:tblW w:type="auto" w:w="0"/>
+        <w:tblLook w:firstColumn="1" w:firstRow="1" w:lastColumn="0" w:lastRow="0" w:noHBand="0" w:noVBand="1" w:val="04A0"/>
+      </w:tblPr>
+      <w:tblGrid>
+        <w:gridCol w:w="5112"/>
+        <w:gridCol w:w="5112"/>
+      </w:tblGrid>
+      <w:tr>
+        <w:tc>
+          <w:tcPr>
+            <w:tcW w:type="dxa" w:w="5112"/>
+          </w:tcPr>
+          <w:p>
+            <w:r>
+              <w:t>Elemento</w:t>
+            </w:r>
+          </w:p>
+        </w:tc>
+        <w:tc>
+          <w:tcPr>
+            <w:tcW w:type="dxa" w:w="5112"/>
+          </w:tcPr>
+          <w:p>
+            <w:r>
+              <w:t>Decision vigente</w:t>
+            </w:r>
+          </w:p>
+        </w:tc>
+      </w:tr>
+      <w:tr>
+        <w:tc>
+          <w:tcPr>
+            <w:tcW w:type="dxa" w:w="5112"/>
+          </w:tcPr>
+          <w:p>
+            <w:r>
+              <w:t>Migracion</w:t>
+            </w:r>
+          </w:p>
+        </w:tc>
+        <w:tc>
+          <w:tcPr>
+            <w:tcW w:type="dxa" w:w="5112"/>
+          </w:tcPr>
+          <w:p>
+            <w:r>
+              <w:t>Alembic 20260503_0008 crea users con email unico, password_hash, rol, estado activo/verificado y fechas.</w:t>
+            </w:r>
+          </w:p>
+        </w:tc>
+      </w:tr>
+      <w:tr>
+        <w:tc>
+          <w:tcPr>
+            <w:tcW w:type="dxa" w:w="5112"/>
+          </w:tcPr>
+          <w:p>
+            <w:r>
+              <w:t>Endpoints</w:t>
+            </w:r>
+          </w:p>
+        </w:tc>
+        <w:tc>
+          <w:tcPr>
+            <w:tcW w:type="dxa" w:w="5112"/>
+          </w:tcPr>
+          <w:p>
+            <w:r>
+              <w:t>POST /api/v1/auth/register, POST /api/v1/auth/login y GET /api/v1/auth/me.</w:t>
+            </w:r>
+          </w:p>
+        </w:tc>
+      </w:tr>
+      <w:tr>
+        <w:tc>
+          <w:tcPr>
+            <w:tcW w:type="dxa" w:w="5112"/>
+          </w:tcPr>
+          <w:p>
+            <w:r>
+              <w:t>Password</w:t>
+            </w:r>
+          </w:p>
+        </w:tc>
+        <w:tc>
+          <w:tcPr>
+            <w:tcW w:type="dxa" w:w="5112"/>
+          </w:tcPr>
+          <w:p>
+            <w:r>
+              <w:t>Hash con bcrypt + pre-hash SHA-256 para evitar el limite de 72 bytes de bcrypt y guardar passwords de forma segura.</w:t>
+            </w:r>
+          </w:p>
+        </w:tc>
+      </w:tr>
+      <w:tr>
+        <w:tc>
+          <w:tcPr>
+            <w:tcW w:type="dxa" w:w="5112"/>
+          </w:tcPr>
+          <w:p>
+            <w:r>
+              <w:t>Tokens</w:t>
+            </w:r>
+          </w:p>
+        </w:tc>
+        <w:tc>
+          <w:tcPr>
+            <w:tcW w:type="dxa" w:w="5112"/>
+          </w:tcPr>
+          <w:p>
+            <w:r>
+              <w:t>JWT HS256 con SECRET_KEY y expiracion configurable por ACCESS_TOKEN_EXPIRE_MINUTES.</w:t>
+            </w:r>
+          </w:p>
+        </w:tc>
+      </w:tr>
+      <w:tr>
+        <w:tc>
+          <w:tcPr>
+            <w:tcW w:type="dxa" w:w="5112"/>
+          </w:tcPr>
+          <w:p>
+            <w:r>
+              <w:t>Alcance actual</w:t>
+            </w:r>
+          </w:p>
+        </w:tc>
+        <w:tc>
+          <w:tcPr>
+            <w:tcW w:type="dxa" w:w="5112"/>
+          </w:tcPr>
+          <w:p>
+            <w:r>
+              <w:t>No se fuerza autenticacion en chat/RAG/codigos todavia para no romper desarrollo local.</w:t>
+            </w:r>
+          </w:p>
+        </w:tc>
+      </w:tr>
+      <w:tr>
+        <w:tc>
+          <w:tcPr>
+            <w:tcW w:type="dxa" w:w="5112"/>
+          </w:tcPr>
+          <w:p>
+            <w:r>
+              <w:t>Pendiente</w:t>
+            </w:r>
+          </w:p>
+        </w:tc>
+        <w:tc>
+          <w:tcPr>
+            <w:tcW w:type="dxa" w:w="5112"/>
+          </w:tcPr>
+          <w:p>
+            <w:r>
+              <w:t>Conectar mobile, guardar token de forma segura, asociar casos/usage a user_id, verificacion de email, password reset, roles/admin y monetizacion futura.</w:t>
+            </w:r>
+          </w:p>
+        </w:tc>
+      </w:tr>
+      <w:tr>
+        <w:tc>
+          <w:tcPr>
+            <w:tcW w:type="dxa" w:w="5112"/>
+          </w:tcPr>
+          <w:p>
+            <w:r>
+              <w:t>Tests</w:t>
+            </w:r>
+          </w:p>
+        </w:tc>
+        <w:tc>
+          <w:tcPr>
+            <w:tcW w:type="dxa" w:w="5112"/>
+          </w:tcPr>
+          <w:p>
+            <w:r>
+              <w:t>Suite Docker verificada: 64 passed.</w:t>
             </w:r>
           </w:p>
         </w:tc>

</xml_diff>